<commit_message>
added exit ticket questions to Week01e and Week02e
</commit_message>
<xml_diff>
--- a/python/CourseDesign/Week02e/Week02easier.docx
+++ b/python/CourseDesign/Week02e/Week02easier.docx
@@ -26114,6 +26114,2992 @@
     <w:bookmarkEnd w:id="127"/>
     <w:bookmarkEnd w:id="128"/>
     <w:bookmarkEnd w:id="129"/>
+    <w:bookmarkStart w:id="131" w:name="X10594bce2cba9d93f8d10ba3c88d923b33276f5"/>
+    <w:bookmarkStart w:id="130" w:name="week-2-lecture-3-exit-tickets"/>
+    <w:p>
+      <w:pPr>
+        <w:pStyle w:val="Heading2"/>
+      </w:pPr>
+      <w:r>
+        <w:t xml:space="preserve">Week 2, Lecture 3, Exit Tickets</w:t>
+      </w:r>
+    </w:p>
+    <w:p>
+      <w:pPr>
+        <w:pStyle w:val="FirstParagraph"/>
+      </w:pPr>
+      <w:r>
+        <w:t xml:space="preserve">What are good exit ticket questions with answers for this lecture?</w:t>
+      </w:r>
+    </w:p>
+    <w:p>
+      <w:pPr>
+        <w:pStyle w:val="BodyText"/>
+      </w:pPr>
+      <w:r>
+        <w:t xml:space="preserve">Chat GPT (Medium):</w:t>
+      </w:r>
+    </w:p>
+    <w:p>
+      <w:pPr>
+        <w:pStyle w:val="BodyText"/>
+      </w:pPr>
+      <w:r>
+        <w:t xml:space="preserve">For this lecture, I’d make the exit ticket short enough to finish in about</w:t>
+      </w:r>
+      <w:r>
+        <w:t xml:space="preserve"> </w:t>
+      </w:r>
+      <w:r>
+        <w:rPr>
+          <w:b/>
+          <w:bCs/>
+        </w:rPr>
+        <w:t xml:space="preserve">3–5 minutes</w:t>
+      </w:r>
+      <w:r>
+        <w:t xml:space="preserve">, but design it to test whether students understand the</w:t>
+      </w:r>
+      <w:r>
+        <w:t xml:space="preserve"> </w:t>
+      </w:r>
+      <w:r>
+        <w:rPr>
+          <w:i/>
+          <w:iCs/>
+        </w:rPr>
+        <w:t xml:space="preserve">reasoning</w:t>
+      </w:r>
+      <w:r>
+        <w:t xml:space="preserve"> </w:t>
+      </w:r>
+      <w:r>
+        <w:t xml:space="preserve">behind sampling rather than just remembering (f_s&gt;2f_M). Your lecture emphasizes the sampling model, spectral replication, aliasing as non-uniqueness, and why anti-alias filtering must occur before sampling or decimation.</w:t>
+      </w:r>
+    </w:p>
+    <w:p>
+      <w:pPr>
+        <w:pStyle w:val="BodyText"/>
+      </w:pPr>
+      <w:r>
+        <w:t xml:space="preserve">Here are some strong choices.</w:t>
+      </w:r>
+    </w:p>
+    <w:p>
+      <w:pPr>
+        <w:numPr>
+          <w:ilvl w:val="0"/>
+          <w:numId w:val="1049"/>
+        </w:numPr>
+      </w:pPr>
+      <w:r>
+        <w:rPr>
+          <w:b/>
+          <w:bCs/>
+        </w:rPr>
+        <w:t xml:space="preserve">A continuous-time signal contains frequencies only up to 7 kHz. What is the minimum theoretical sampling rate required to avoid aliasing?</w:t>
+      </w:r>
+    </w:p>
+    <w:p>
+      <w:pPr>
+        <w:numPr>
+          <w:ilvl w:val="0"/>
+          <w:numId w:val="1000"/>
+        </w:numPr>
+      </w:pPr>
+      <w:r>
+        <w:rPr>
+          <w:b/>
+          <w:bCs/>
+        </w:rPr>
+        <w:t xml:space="preserve">Answer:</w:t>
+      </w:r>
+    </w:p>
+    <w:p>
+      <w:pPr>
+        <w:pStyle w:val="BodyText"/>
+      </w:pPr>
+      <m:oMathPara>
+        <m:oMathParaPr>
+          <m:jc m:val="center"/>
+        </m:oMathParaPr>
+        <m:oMath>
+          <m:sSub>
+            <m:e>
+              <m:r>
+                <m:t>f</m:t>
+              </m:r>
+            </m:e>
+            <m:sub>
+              <m:r>
+                <m:t>s</m:t>
+              </m:r>
+            </m:sub>
+          </m:sSub>
+          <m:r>
+            <m:rPr>
+              <m:sty m:val="p"/>
+            </m:rPr>
+            <m:t>&gt;</m:t>
+          </m:r>
+          <m:r>
+            <m:t>2</m:t>
+          </m:r>
+          <m:sSub>
+            <m:e>
+              <m:r>
+                <m:t>f</m:t>
+              </m:r>
+            </m:e>
+            <m:sub>
+              <m:r>
+                <m:t>M</m:t>
+              </m:r>
+            </m:sub>
+          </m:sSub>
+          <m:r>
+            <m:rPr>
+              <m:sty m:val="p"/>
+            </m:rPr>
+            <m:t>=</m:t>
+          </m:r>
+          <m:r>
+            <m:t>14</m:t>
+          </m:r>
+          <m:r>
+            <m:rPr>
+              <m:nor/>
+              <m:sty m:val="p"/>
+            </m:rPr>
+            <m:t> kHz</m:t>
+          </m:r>
+        </m:oMath>
+      </m:oMathPara>
+    </w:p>
+    <w:p>
+      <w:pPr>
+        <w:numPr>
+          <w:ilvl w:val="0"/>
+          <w:numId w:val="1000"/>
+        </w:numPr>
+      </w:pPr>
+      <w:r>
+        <w:t xml:space="preserve">So theoretically the sampling rate must be</w:t>
+      </w:r>
+      <w:r>
+        <w:t xml:space="preserve"> </w:t>
+      </w:r>
+      <w:r>
+        <w:rPr>
+          <w:b/>
+          <w:bCs/>
+        </w:rPr>
+        <w:t xml:space="preserve">greater than 14 kHz</w:t>
+      </w:r>
+      <w:r>
+        <w:t xml:space="preserve">. In practice, you would choose something higher to allow room for the anti-alias filter transition band.</w:t>
+      </w:r>
+    </w:p>
+    <w:p>
+      <w:pPr>
+        <w:numPr>
+          <w:ilvl w:val="0"/>
+          <w:numId w:val="1000"/>
+        </w:numPr>
+      </w:pPr>
+      <w:r>
+        <w:rPr>
+          <w:b/>
+          <w:bCs/>
+        </w:rPr>
+        <w:t xml:space="preserve">What this tests:</w:t>
+      </w:r>
+      <w:r>
+        <w:t xml:space="preserve"> </w:t>
+      </w:r>
+      <w:r>
+        <w:t xml:space="preserve">Whether students distinguish the signal bandwidth from the Nyquist frequency and can apply the no-overlap condition. Your slides explicitly distinguish the Nyquist frequency (f_s/2) from the Nyquist rate (2f_M).</w:t>
+      </w:r>
+    </w:p>
+    <w:p>
+      <w:pPr>
+        <w:numPr>
+          <w:ilvl w:val="0"/>
+          <w:numId w:val="1049"/>
+        </w:numPr>
+      </w:pPr>
+      <w:r>
+        <w:rPr>
+          <w:b/>
+          <w:bCs/>
+        </w:rPr>
+        <w:t xml:space="preserve">A 9 kHz sinusoid is sampled at (f_s=12) kHz. What frequency will appear in the sampled data?</w:t>
+      </w:r>
+    </w:p>
+    <w:p>
+      <w:pPr>
+        <w:numPr>
+          <w:ilvl w:val="0"/>
+          <w:numId w:val="1000"/>
+        </w:numPr>
+      </w:pPr>
+      <w:r>
+        <w:rPr>
+          <w:b/>
+          <w:bCs/>
+        </w:rPr>
+        <w:t xml:space="preserve">Answer:</w:t>
+      </w:r>
+      <w:r>
+        <w:t xml:space="preserve"> </w:t>
+      </w:r>
+      <w:r>
+        <w:t xml:space="preserve">The Nyquist frequency is 6 kHz. The 9 kHz sinusoid folds around 6 kHz:</w:t>
+      </w:r>
+    </w:p>
+    <w:p>
+      <w:pPr>
+        <w:pStyle w:val="BodyText"/>
+      </w:pPr>
+      <m:oMathPara>
+        <m:oMathParaPr>
+          <m:jc m:val="center"/>
+        </m:oMathParaPr>
+        <m:oMath>
+          <m:sSub>
+            <m:e>
+              <m:r>
+                <m:t>f</m:t>
+              </m:r>
+            </m:e>
+            <m:sub>
+              <m:r>
+                <m:rPr>
+                  <m:nor/>
+                  <m:sty m:val="p"/>
+                </m:rPr>
+                <m:t>alias</m:t>
+              </m:r>
+            </m:sub>
+          </m:sSub>
+          <m:r>
+            <m:rPr>
+              <m:sty m:val="p"/>
+            </m:rPr>
+            <m:t>=</m:t>
+          </m:r>
+          <m:d>
+            <m:dPr>
+              <m:begChr m:val="|"/>
+              <m:endChr m:val="|"/>
+              <m:sepChr m:val=""/>
+              <m:grow/>
+            </m:dPr>
+            <m:e>
+              <m:r>
+                <m:t>9</m:t>
+              </m:r>
+              <m:r>
+                <m:rPr>
+                  <m:sty m:val="p"/>
+                </m:rPr>
+                <m:t>−</m:t>
+              </m:r>
+              <m:r>
+                <m:t>12</m:t>
+              </m:r>
+            </m:e>
+          </m:d>
+          <m:r>
+            <m:rPr>
+              <m:sty m:val="p"/>
+            </m:rPr>
+            <m:t>=</m:t>
+          </m:r>
+          <m:r>
+            <m:t>3</m:t>
+          </m:r>
+          <m:r>
+            <m:rPr>
+              <m:nor/>
+              <m:sty m:val="p"/>
+            </m:rPr>
+            <m:t> kHz</m:t>
+          </m:r>
+          <m:r>
+            <m:rPr>
+              <m:sty m:val="p"/>
+            </m:rPr>
+            <m:t>.</m:t>
+          </m:r>
+        </m:oMath>
+      </m:oMathPara>
+    </w:p>
+    <w:p>
+      <w:pPr>
+        <w:numPr>
+          <w:ilvl w:val="0"/>
+          <w:numId w:val="1000"/>
+        </w:numPr>
+      </w:pPr>
+      <w:r>
+        <w:t xml:space="preserve">So the sampled data looks like a</w:t>
+      </w:r>
+      <w:r>
+        <w:t xml:space="preserve"> </w:t>
+      </w:r>
+      <w:r>
+        <w:rPr>
+          <w:b/>
+          <w:bCs/>
+        </w:rPr>
+        <w:t xml:space="preserve">3 kHz sinusoid</w:t>
+      </w:r>
+      <w:r>
+        <w:t xml:space="preserve">.</w:t>
+      </w:r>
+    </w:p>
+    <w:p>
+      <w:pPr>
+        <w:numPr>
+          <w:ilvl w:val="0"/>
+          <w:numId w:val="1000"/>
+        </w:numPr>
+      </w:pPr>
+      <w:r>
+        <w:rPr>
+          <w:b/>
+          <w:bCs/>
+        </w:rPr>
+        <w:t xml:space="preserve">What this tests:</w:t>
+      </w:r>
+      <w:r>
+        <w:t xml:space="preserve"> </w:t>
+      </w:r>
+      <w:r>
+        <w:t xml:space="preserve">Whether students can actually predict an alias rather than only say “aliasing occurs.”</w:t>
+      </w:r>
+    </w:p>
+    <w:p>
+      <w:pPr>
+        <w:numPr>
+          <w:ilvl w:val="0"/>
+          <w:numId w:val="1049"/>
+        </w:numPr>
+      </w:pPr>
+      <w:r>
+        <w:rPr>
+          <w:b/>
+          <w:bCs/>
+        </w:rPr>
+        <w:t xml:space="preserve">True or false: If aliasing occurs during sampling, we can usually remove it afterward with a digital low-pass filter. Explain in one sentence.</w:t>
+      </w:r>
+    </w:p>
+    <w:p>
+      <w:pPr>
+        <w:numPr>
+          <w:ilvl w:val="0"/>
+          <w:numId w:val="1000"/>
+        </w:numPr>
+      </w:pPr>
+      <w:r>
+        <w:rPr>
+          <w:b/>
+          <w:bCs/>
+        </w:rPr>
+        <w:t xml:space="preserve">Answer:</w:t>
+      </w:r>
+      <w:r>
+        <w:t xml:space="preserve"> </w:t>
+      </w:r>
+      <w:r>
+        <w:rPr>
+          <w:b/>
+          <w:bCs/>
+        </w:rPr>
+        <w:t xml:space="preserve">False.</w:t>
+      </w:r>
+      <w:r>
+        <w:t xml:space="preserve"> </w:t>
+      </w:r>
+      <w:r>
+        <w:t xml:space="preserve">Once aliasing occurs, an aliased component and a genuine in-band component can produce the same samples, so the digital system cannot determine which one was originally present.</w:t>
+      </w:r>
+    </w:p>
+    <w:p>
+      <w:pPr>
+        <w:numPr>
+          <w:ilvl w:val="0"/>
+          <w:numId w:val="1000"/>
+        </w:numPr>
+      </w:pPr>
+      <w:r>
+        <w:t xml:space="preserve">This is one of the most important conceptual points in the lecture: aliasing is a loss of uniqueness, not simply extra noise.</w:t>
+      </w:r>
+    </w:p>
+    <w:p>
+      <w:pPr>
+        <w:numPr>
+          <w:ilvl w:val="0"/>
+          <w:numId w:val="1049"/>
+        </w:numPr>
+      </w:pPr>
+      <w:r>
+        <w:rPr>
+          <w:b/>
+          <w:bCs/>
+        </w:rPr>
+        <w:t xml:space="preserve">Why does sampling create repeated copies of the analog spectrum?</w:t>
+      </w:r>
+    </w:p>
+    <w:p>
+      <w:pPr>
+        <w:numPr>
+          <w:ilvl w:val="0"/>
+          <w:numId w:val="1000"/>
+        </w:numPr>
+      </w:pPr>
+      <w:r>
+        <w:rPr>
+          <w:b/>
+          <w:bCs/>
+        </w:rPr>
+        <w:t xml:space="preserve">Good answer:</w:t>
+      </w:r>
+      <w:r>
+        <w:t xml:space="preserve"> </w:t>
+      </w:r>
+      <w:r>
+        <w:t xml:space="preserve">Because ideal sampling multiplies the continuous-time signal by a periodic impulse train. Multiplication in time corresponds to convolution in frequency, and the Fourier transform of the impulse train is itself an impulse train. Convolving (X_c(j\Omega)) with those impulses creates shifted copies of the spectrum spaced by the sampling frequency.</w:t>
+      </w:r>
+    </w:p>
+    <w:p>
+      <w:pPr>
+        <w:numPr>
+          <w:ilvl w:val="0"/>
+          <w:numId w:val="1000"/>
+        </w:numPr>
+      </w:pPr>
+      <w:r>
+        <w:rPr>
+          <w:b/>
+          <w:bCs/>
+        </w:rPr>
+        <w:t xml:space="preserve">Excellent student answer:</w:t>
+      </w:r>
+      <w:r>
+        <w:t xml:space="preserve"> </w:t>
+      </w:r>
+      <w:r>
+        <w:t xml:space="preserve">“Sampling multiplies (x_c(t)) by an impulse train; in frequency this becomes convolution with another impulse train, producing replicas of (X_c(j\Omega)) every (\Omega_s).”</w:t>
+      </w:r>
+    </w:p>
+    <w:p>
+      <w:pPr>
+        <w:numPr>
+          <w:ilvl w:val="0"/>
+          <w:numId w:val="1000"/>
+        </w:numPr>
+      </w:pPr>
+      <w:r>
+        <w:t xml:space="preserve">That is almost exactly the central derivation developed in the lecture.</w:t>
+      </w:r>
+    </w:p>
+    <w:p>
+      <w:pPr>
+        <w:numPr>
+          <w:ilvl w:val="0"/>
+          <w:numId w:val="1049"/>
+        </w:numPr>
+      </w:pPr>
+      <w:r>
+        <w:rPr>
+          <w:b/>
+          <w:bCs/>
+        </w:rPr>
+        <w:t xml:space="preserve">Suppose two different continuous-time sinusoids produce exactly the same discrete-time samples. What phenomenon does this illustrate?</w:t>
+      </w:r>
+    </w:p>
+    <w:p>
+      <w:pPr>
+        <w:numPr>
+          <w:ilvl w:val="0"/>
+          <w:numId w:val="1000"/>
+        </w:numPr>
+      </w:pPr>
+      <w:r>
+        <w:rPr>
+          <w:b/>
+          <w:bCs/>
+        </w:rPr>
+        <w:t xml:space="preserve">Answer:</w:t>
+      </w:r>
+      <w:r>
+        <w:t xml:space="preserve"> </w:t>
+      </w:r>
+      <w:r>
+        <w:rPr>
+          <w:b/>
+          <w:bCs/>
+        </w:rPr>
+        <w:t xml:space="preserve">Aliasing.</w:t>
+      </w:r>
+    </w:p>
+    <w:p>
+      <w:pPr>
+        <w:numPr>
+          <w:ilvl w:val="0"/>
+          <w:numId w:val="1000"/>
+        </w:numPr>
+      </w:pPr>
+      <w:r>
+        <w:rPr>
+          <w:b/>
+          <w:bCs/>
+        </w:rPr>
+        <w:t xml:space="preserve">Better answer:</w:t>
+      </w:r>
+      <w:r>
+        <w:t xml:space="preserve"> </w:t>
+      </w:r>
+      <w:r>
+        <w:t xml:space="preserve">Aliasing demonstrates that the mapping from continuous-time signals to samples is no longer one-to-one; multiple analog signals are consistent with the same digital sequence.</w:t>
+      </w:r>
+    </w:p>
+    <w:p>
+      <w:pPr>
+        <w:numPr>
+          <w:ilvl w:val="0"/>
+          <w:numId w:val="1000"/>
+        </w:numPr>
+      </w:pPr>
+      <w:r>
+        <w:rPr>
+          <w:b/>
+          <w:bCs/>
+        </w:rPr>
+        <w:t xml:space="preserve">What this tests:</w:t>
+      </w:r>
+      <w:r>
+        <w:t xml:space="preserve"> </w:t>
+      </w:r>
+      <w:r>
+        <w:t xml:space="preserve">Whether they understand the deeper idea that aliasing is</w:t>
+      </w:r>
+      <w:r>
+        <w:t xml:space="preserve"> </w:t>
+      </w:r>
+      <w:r>
+        <w:rPr>
+          <w:b/>
+          <w:bCs/>
+        </w:rPr>
+        <w:t xml:space="preserve">non-uniqueness</w:t>
+      </w:r>
+      <w:r>
+        <w:t xml:space="preserve"> </w:t>
+      </w:r>
+      <w:r>
+        <w:t xml:space="preserve">rather than merely “frequencies getting messed up.” Your lecture makes that distinction explicitly.</w:t>
+      </w:r>
+    </w:p>
+    <w:p>
+      <w:pPr>
+        <w:numPr>
+          <w:ilvl w:val="0"/>
+          <w:numId w:val="1049"/>
+        </w:numPr>
+      </w:pPr>
+      <w:r>
+        <w:rPr>
+          <w:b/>
+          <w:bCs/>
+        </w:rPr>
+        <w:t xml:space="preserve">You have audio sampled at 48 kHz and want to reduce the rate to 12 kHz. Why is</w:t>
+      </w:r>
+      <w:r>
+        <w:rPr>
+          <w:b/>
+          <w:bCs/>
+        </w:rPr>
+        <w:t xml:space="preserve"> </w:t>
+      </w:r>
+      <w:r>
+        <w:rPr>
+          <w:rStyle w:val="VerbatimChar"/>
+          <w:b/>
+          <w:bCs/>
+        </w:rPr>
+        <w:t xml:space="preserve">x[::4]</w:t>
+      </w:r>
+      <w:r>
+        <w:rPr>
+          <w:b/>
+          <w:bCs/>
+        </w:rPr>
+        <w:t xml:space="preserve"> </w:t>
+      </w:r>
+      <w:r>
+        <w:rPr>
+          <w:b/>
+          <w:bCs/>
+        </w:rPr>
+        <w:t xml:space="preserve">potentially wrong? What should you do instead?</w:t>
+      </w:r>
+    </w:p>
+    <w:p>
+      <w:pPr>
+        <w:numPr>
+          <w:ilvl w:val="0"/>
+          <w:numId w:val="1000"/>
+        </w:numPr>
+      </w:pPr>
+      <w:r>
+        <w:rPr>
+          <w:b/>
+          <w:bCs/>
+        </w:rPr>
+        <w:t xml:space="preserve">Answer:</w:t>
+      </w:r>
+      <w:r>
+        <w:t xml:space="preserve"> </w:t>
+      </w:r>
+      <w:r>
+        <w:t xml:space="preserve">Keeping every fourth sample changes the Nyquist frequency from 24 kHz to 6 kHz. Any energy above 6 kHz can therefore alias into the new baseband.</w:t>
+      </w:r>
+    </w:p>
+    <w:p>
+      <w:pPr>
+        <w:numPr>
+          <w:ilvl w:val="0"/>
+          <w:numId w:val="1000"/>
+        </w:numPr>
+      </w:pPr>
+      <w:r>
+        <w:t xml:space="preserve">Correct procedure:</w:t>
+      </w:r>
+    </w:p>
+    <w:p>
+      <w:pPr>
+        <w:pStyle w:val="BodyText"/>
+      </w:pPr>
+      <m:oMathPara>
+        <m:oMathParaPr>
+          <m:jc m:val="center"/>
+        </m:oMathParaPr>
+        <m:oMath>
+          <m:borderBox>
+            <m:e>
+              <m:r>
+                <m:rPr>
+                  <m:nor/>
+                  <m:sty m:val="p"/>
+                </m:rPr>
+                <m:t>Low-pass filter first</m:t>
+              </m:r>
+              <m:r>
+                <m:rPr>
+                  <m:sty m:val="p"/>
+                </m:rPr>
+                <m:t>→</m:t>
+              </m:r>
+              <m:r>
+                <m:rPr>
+                  <m:nor/>
+                  <m:sty m:val="p"/>
+                </m:rPr>
+                <m:t>downsample by 4</m:t>
+              </m:r>
+            </m:e>
+          </m:borderBox>
+        </m:oMath>
+      </m:oMathPara>
+    </w:p>
+    <w:p>
+      <w:pPr>
+        <w:numPr>
+          <w:ilvl w:val="0"/>
+          <w:numId w:val="1000"/>
+        </w:numPr>
+      </w:pPr>
+      <w:r>
+        <w:t xml:space="preserve">This connects sampling theory directly to the practical decimation example in the lecture.</w:t>
+      </w:r>
+    </w:p>
+    <w:p>
+      <w:pPr>
+        <w:numPr>
+          <w:ilvl w:val="0"/>
+          <w:numId w:val="1049"/>
+        </w:numPr>
+      </w:pPr>
+      <w:r>
+        <w:rPr>
+          <w:b/>
+          <w:bCs/>
+        </w:rPr>
+        <w:t xml:space="preserve">A 10 kHz component is present in a 48 kHz recording. The recording is naively downsampled to 12 kHz. Where will the 10 kHz component appear?</w:t>
+      </w:r>
+    </w:p>
+    <w:p>
+      <w:pPr>
+        <w:numPr>
+          <w:ilvl w:val="0"/>
+          <w:numId w:val="1000"/>
+        </w:numPr>
+      </w:pPr>
+      <w:r>
+        <w:rPr>
+          <w:b/>
+          <w:bCs/>
+        </w:rPr>
+        <w:t xml:space="preserve">Answer:</w:t>
+      </w:r>
+    </w:p>
+    <w:p>
+      <w:pPr>
+        <w:pStyle w:val="BodyText"/>
+      </w:pPr>
+      <m:oMathPara>
+        <m:oMathParaPr>
+          <m:jc m:val="center"/>
+        </m:oMathParaPr>
+        <m:oMath>
+          <m:sSub>
+            <m:e>
+              <m:r>
+                <m:t>f</m:t>
+              </m:r>
+            </m:e>
+            <m:sub>
+              <m:r>
+                <m:rPr>
+                  <m:nor/>
+                  <m:sty m:val="p"/>
+                </m:rPr>
+                <m:t>alias</m:t>
+              </m:r>
+            </m:sub>
+          </m:sSub>
+          <m:r>
+            <m:rPr>
+              <m:sty m:val="p"/>
+            </m:rPr>
+            <m:t>=</m:t>
+          </m:r>
+          <m:d>
+            <m:dPr>
+              <m:begChr m:val="|"/>
+              <m:endChr m:val="|"/>
+              <m:sepChr m:val=""/>
+              <m:grow/>
+            </m:dPr>
+            <m:e>
+              <m:r>
+                <m:t>10</m:t>
+              </m:r>
+              <m:r>
+                <m:rPr>
+                  <m:sty m:val="p"/>
+                </m:rPr>
+                <m:t>−</m:t>
+              </m:r>
+              <m:r>
+                <m:t>12</m:t>
+              </m:r>
+            </m:e>
+          </m:d>
+          <m:r>
+            <m:rPr>
+              <m:sty m:val="p"/>
+            </m:rPr>
+            <m:t>=</m:t>
+          </m:r>
+          <m:r>
+            <m:t>2</m:t>
+          </m:r>
+          <m:r>
+            <m:rPr>
+              <m:nor/>
+              <m:sty m:val="p"/>
+            </m:rPr>
+            <m:t> kHz</m:t>
+          </m:r>
+          <m:r>
+            <m:rPr>
+              <m:sty m:val="p"/>
+            </m:rPr>
+            <m:t>.</m:t>
+          </m:r>
+        </m:oMath>
+      </m:oMathPara>
+    </w:p>
+    <w:p>
+      <w:pPr>
+        <w:numPr>
+          <w:ilvl w:val="0"/>
+          <w:numId w:val="1000"/>
+        </w:numPr>
+      </w:pPr>
+      <w:r>
+        <w:t xml:space="preserve">It appears falsely as a</w:t>
+      </w:r>
+      <w:r>
+        <w:t xml:space="preserve"> </w:t>
+      </w:r>
+      <w:r>
+        <w:rPr>
+          <w:b/>
+          <w:bCs/>
+        </w:rPr>
+        <w:t xml:space="preserve">2 kHz component</w:t>
+      </w:r>
+      <w:r>
+        <w:t xml:space="preserve">.</w:t>
+      </w:r>
+    </w:p>
+    <w:p>
+      <w:pPr>
+        <w:numPr>
+          <w:ilvl w:val="0"/>
+          <w:numId w:val="1000"/>
+        </w:numPr>
+      </w:pPr>
+      <w:r>
+        <w:rPr>
+          <w:b/>
+          <w:bCs/>
+        </w:rPr>
+        <w:t xml:space="preserve">Follow-up:</w:t>
+      </w:r>
+      <w:r>
+        <w:t xml:space="preserve"> </w:t>
+      </w:r>
+      <w:r>
+        <w:t xml:space="preserve">Why could this be particularly dangerous for a machine-learning classifier?</w:t>
+      </w:r>
+    </w:p>
+    <w:p>
+      <w:pPr>
+        <w:numPr>
+          <w:ilvl w:val="0"/>
+          <w:numId w:val="1000"/>
+        </w:numPr>
+      </w:pPr>
+      <w:r>
+        <w:rPr>
+          <w:b/>
+          <w:bCs/>
+        </w:rPr>
+        <w:t xml:space="preserve">Answer:</w:t>
+      </w:r>
+      <w:r>
+        <w:t xml:space="preserve"> </w:t>
+      </w:r>
+      <w:r>
+        <w:t xml:space="preserve">Because the classifier may learn the repeatable 2 kHz alias as though it were a real physical feature of the signal. Your lecture specifically emphasizes that a CNN cannot know that this structure originated as an alias.</w:t>
+      </w:r>
+    </w:p>
+    <w:p>
+      <w:pPr>
+        <w:numPr>
+          <w:ilvl w:val="0"/>
+          <w:numId w:val="1049"/>
+        </w:numPr>
+      </w:pPr>
+      <w:r>
+        <w:rPr>
+          <w:b/>
+          <w:bCs/>
+        </w:rPr>
+        <w:t xml:space="preserve">Complete the sentence: An anti-alias filter must be placed ______ the ADC because ______.</w:t>
+      </w:r>
+    </w:p>
+    <w:p>
+      <w:pPr>
+        <w:numPr>
+          <w:ilvl w:val="0"/>
+          <w:numId w:val="1000"/>
+        </w:numPr>
+      </w:pPr>
+      <w:r>
+        <w:rPr>
+          <w:b/>
+          <w:bCs/>
+        </w:rPr>
+        <w:t xml:space="preserve">Answer:</w:t>
+      </w:r>
+      <w:r>
+        <w:t xml:space="preserve"> </w:t>
+      </w:r>
+      <w:r>
+        <w:t xml:space="preserve">“An anti-alias filter must be placed</w:t>
+      </w:r>
+      <w:r>
+        <w:t xml:space="preserve"> </w:t>
+      </w:r>
+      <w:r>
+        <w:rPr>
+          <w:b/>
+          <w:bCs/>
+        </w:rPr>
+        <w:t xml:space="preserve">before</w:t>
+      </w:r>
+      <w:r>
+        <w:t xml:space="preserve"> </w:t>
+      </w:r>
+      <w:r>
+        <w:t xml:space="preserve">the ADC because once out-of-band energy folds into the sampled baseband, its original frequency cannot generally be recovered.”</w:t>
+      </w:r>
+    </w:p>
+    <w:p>
+      <w:pPr>
+        <w:numPr>
+          <w:ilvl w:val="0"/>
+          <w:numId w:val="1000"/>
+        </w:numPr>
+      </w:pPr>
+      <w:r>
+        <w:rPr>
+          <w:b/>
+          <w:bCs/>
+        </w:rPr>
+        <w:t xml:space="preserve">What this tests:</w:t>
+      </w:r>
+      <w:r>
+        <w:t xml:space="preserve"> </w:t>
+      </w:r>
+      <w:r>
+        <w:t xml:space="preserve">Whether students understand the physical ordering, not merely the vocabulary.</w:t>
+      </w:r>
+    </w:p>
+    <w:p>
+      <w:pPr>
+        <w:pStyle w:val="FirstParagraph"/>
+      </w:pPr>
+      <w:r>
+        <w:t xml:space="preserve">For this particular lecture, my favorite</w:t>
+      </w:r>
+      <w:r>
+        <w:t xml:space="preserve"> </w:t>
+      </w:r>
+      <w:r>
+        <w:rPr>
+          <w:b/>
+          <w:bCs/>
+        </w:rPr>
+        <w:t xml:space="preserve">three-question exit ticket</w:t>
+      </w:r>
+      <w:r>
+        <w:t xml:space="preserve"> </w:t>
+      </w:r>
+      <w:r>
+        <w:t xml:space="preserve">would be:</w:t>
+      </w:r>
+    </w:p>
+    <w:p>
+      <w:pPr>
+        <w:pStyle w:val="BlockText"/>
+      </w:pPr>
+      <w:r>
+        <w:rPr>
+          <w:b/>
+          <w:bCs/>
+        </w:rPr>
+        <w:t xml:space="preserve">1.</w:t>
+      </w:r>
+      <w:r>
+        <w:t xml:space="preserve"> </w:t>
+      </w:r>
+      <w:r>
+        <w:t xml:space="preserve">A 9 kHz tone is sampled at 12 kHz. What frequency appears in the samples?</w:t>
+      </w:r>
+      <w:r>
+        <w:t xml:space="preserve"> </w:t>
+      </w:r>
+      <w:r>
+        <w:rPr>
+          <w:b/>
+          <w:bCs/>
+        </w:rPr>
+        <w:t xml:space="preserve">Answer:</w:t>
+      </w:r>
+      <w:r>
+        <w:t xml:space="preserve"> </w:t>
+      </w:r>
+      <w:r>
+        <w:t xml:space="preserve">3 kHz.</w:t>
+      </w:r>
+    </w:p>
+    <w:p>
+      <w:pPr>
+        <w:pStyle w:val="BlockText"/>
+      </w:pPr>
+      <w:r>
+        <w:rPr>
+          <w:b/>
+          <w:bCs/>
+        </w:rPr>
+        <w:t xml:space="preserve">2.</w:t>
+      </w:r>
+      <w:r>
+        <w:t xml:space="preserve"> </w:t>
+      </w:r>
+      <w:r>
+        <w:t xml:space="preserve">Why can't a digital filter generally remove aliasing after sampling?</w:t>
+      </w:r>
+      <w:r>
+        <w:t xml:space="preserve"> </w:t>
+      </w:r>
+      <w:r>
+        <w:rPr>
+          <w:b/>
+          <w:bCs/>
+        </w:rPr>
+        <w:t xml:space="preserve">Answer:</w:t>
+      </w:r>
+      <w:r>
+        <w:t xml:space="preserve"> </w:t>
+      </w:r>
+      <w:r>
+        <w:t xml:space="preserve">Because after frequencies fold together, genuine in-band and aliased components are indistinguishable.</w:t>
+      </w:r>
+    </w:p>
+    <w:p>
+      <w:pPr>
+        <w:pStyle w:val="BlockText"/>
+      </w:pPr>
+      <w:r>
+        <w:rPr>
+          <w:b/>
+          <w:bCs/>
+        </w:rPr>
+        <w:t xml:space="preserve">3.</w:t>
+      </w:r>
+      <w:r>
+        <w:t xml:space="preserve"> </w:t>
+      </w:r>
+      <w:r>
+        <w:t xml:space="preserve">In one or two sentences, explain why sampling creates spectral replicas.</w:t>
+      </w:r>
+      <w:r>
+        <w:t xml:space="preserve"> </w:t>
+      </w:r>
+      <w:r>
+        <w:rPr>
+          <w:b/>
+          <w:bCs/>
+        </w:rPr>
+        <w:t xml:space="preserve">Answer:</w:t>
+      </w:r>
+      <w:r>
+        <w:t xml:space="preserve"> </w:t>
+      </w:r>
+      <w:r>
+        <w:t xml:space="preserve">Sampling multiplies the signal by a periodic impulse train. Multiplication in time becomes convolution in frequency, creating shifted copies of the original spectrum at multiples of the sampling frequency.</w:t>
+      </w:r>
+    </w:p>
+    <w:p>
+      <w:pPr>
+        <w:pStyle w:val="FirstParagraph"/>
+      </w:pPr>
+      <w:r>
+        <w:t xml:space="preserve">That combination is particularly useful because</w:t>
+      </w:r>
+      <w:r>
+        <w:t xml:space="preserve"> </w:t>
+      </w:r>
+      <w:r>
+        <w:rPr>
+          <w:b/>
+          <w:bCs/>
+        </w:rPr>
+        <w:t xml:space="preserve">Question 1 tests calculation, Question 2 tests physical/conceptual understanding, and Question 3 tests whether they understood the mathematical mechanism</w:t>
+      </w:r>
+      <w:r>
+        <w:t xml:space="preserve">. Together they give you a better diagnosis than three Nyquist-rate calculations.</w:t>
+      </w:r>
+    </w:p>
+    <w:p>
+      <w:pPr>
+        <w:pStyle w:val="BodyText"/>
+      </w:pPr>
+      <w:r>
+        <w:t xml:space="preserve">One question I would</w:t>
+      </w:r>
+      <w:r>
+        <w:t xml:space="preserve"> </w:t>
+      </w:r>
+      <w:r>
+        <w:rPr>
+          <w:b/>
+          <w:bCs/>
+        </w:rPr>
+        <w:t xml:space="preserve">not</w:t>
+      </w:r>
+      <w:r>
+        <w:t xml:space="preserve"> </w:t>
+      </w:r>
+      <w:r>
+        <w:t xml:space="preserve">use as the primary exit-ticket question is simply,</w:t>
+      </w:r>
+      <w:r>
+        <w:t xml:space="preserve"> </w:t>
+      </w:r>
+      <w:r>
+        <w:rPr>
+          <w:i/>
+          <w:iCs/>
+        </w:rPr>
+        <w:t xml:space="preserve">“State the Nyquist sampling theorem.”</w:t>
+      </w:r>
+      <w:r>
+        <w:t xml:space="preserve"> </w:t>
+      </w:r>
+      <w:r>
+        <w:t xml:space="preserve">A student can memorize (f_s&gt;2f_M) and still misunderstand essentially everything important in this lecture. Your stated learning objective is specifically that students should be able to</w:t>
+      </w:r>
+      <w:r>
+        <w:t xml:space="preserve"> </w:t>
+      </w:r>
+      <w:r>
+        <w:rPr>
+          <w:b/>
+          <w:bCs/>
+        </w:rPr>
+        <w:t xml:space="preserve">derive—not just quote—the sampling theorem</w:t>
+      </w:r>
+      <w:r>
+        <w:t xml:space="preserve">, so the exit ticket should reflect that goal.</w:t>
+      </w:r>
+    </w:p>
+    <w:p>
+      <w:r>
+        <w:pict>
+          <v:rect style="width:0;height:1.5pt" o:hralign="center" o:hrstd="t" o:hr="t"/>
+        </w:pict>
+      </w:r>
+    </w:p>
+    <w:bookmarkEnd w:id="130"/>
+    <w:bookmarkEnd w:id="131"/>
+    <w:bookmarkStart w:id="133" w:name="ec782d78-7c8f-4506-bd08-686dc0f27ccb"/>
+    <w:bookmarkStart w:id="132" w:name="week-2-lecture-4-exit-tickets"/>
+    <w:p>
+      <w:pPr>
+        <w:pStyle w:val="Heading2"/>
+      </w:pPr>
+      <w:r>
+        <w:t xml:space="preserve">Week 2, Lecture 4, Exit Tickets</w:t>
+      </w:r>
+    </w:p>
+    <w:p>
+      <w:pPr>
+        <w:pStyle w:val="FirstParagraph"/>
+      </w:pPr>
+      <w:r>
+        <w:t xml:space="preserve">What are good exit ticket questions with answers for this lecture?</w:t>
+      </w:r>
+    </w:p>
+    <w:p>
+      <w:pPr>
+        <w:pStyle w:val="BodyText"/>
+      </w:pPr>
+      <w:r>
+        <w:t xml:space="preserve">Chat GPT (Medium):</w:t>
+      </w:r>
+    </w:p>
+    <w:p>
+      <w:pPr>
+        <w:pStyle w:val="BodyText"/>
+      </w:pPr>
+      <w:r>
+        <w:t xml:space="preserve">For this lecture, I’d make the exit ticket test three different things:</w:t>
+      </w:r>
+      <w:r>
+        <w:t xml:space="preserve"> </w:t>
+      </w:r>
+      <w:r>
+        <w:rPr>
+          <w:b/>
+          <w:bCs/>
+        </w:rPr>
+        <w:t xml:space="preserve">ideal reconstruction</w:t>
+      </w:r>
+      <w:r>
+        <w:t xml:space="preserve">,</w:t>
+      </w:r>
+      <w:r>
+        <w:t xml:space="preserve"> </w:t>
+      </w:r>
+      <w:r>
+        <w:rPr>
+          <w:b/>
+          <w:bCs/>
+        </w:rPr>
+        <w:t xml:space="preserve">practical DAC behavior</w:t>
+      </w:r>
+      <w:r>
+        <w:t xml:space="preserve">, and</w:t>
+      </w:r>
+      <w:r>
+        <w:t xml:space="preserve"> </w:t>
+      </w:r>
+      <w:r>
+        <w:rPr>
+          <w:b/>
+          <w:bCs/>
+        </w:rPr>
+        <w:t xml:space="preserve">quantization/SQNR</w:t>
+      </w:r>
+      <w:r>
+        <w:t xml:space="preserve">. That matches the lecture’s stated outcomes very well.</w:t>
+      </w:r>
+    </w:p>
+    <w:p>
+      <w:pPr>
+        <w:pStyle w:val="BodyText"/>
+      </w:pPr>
+      <w:r>
+        <w:t xml:space="preserve">Here are several good choices with answers.</w:t>
+      </w:r>
+    </w:p>
+    <w:p>
+      <w:pPr>
+        <w:numPr>
+          <w:ilvl w:val="0"/>
+          <w:numId w:val="1050"/>
+        </w:numPr>
+      </w:pPr>
+      <w:r>
+        <w:rPr>
+          <w:b/>
+          <w:bCs/>
+        </w:rPr>
+        <w:t xml:space="preserve">Why does ideal reconstruction use sinc functions?</w:t>
+      </w:r>
+    </w:p>
+    <w:p>
+      <w:pPr>
+        <w:numPr>
+          <w:ilvl w:val="0"/>
+          <w:numId w:val="1000"/>
+        </w:numPr>
+      </w:pPr>
+      <w:r>
+        <w:rPr>
+          <w:b/>
+          <w:bCs/>
+        </w:rPr>
+        <w:t xml:space="preserve">Answer:</w:t>
+      </w:r>
+      <w:r>
+        <w:t xml:space="preserve"> </w:t>
+      </w:r>
+      <w:r>
+        <w:t xml:space="preserve">Because the ideal reconstruction filter is a brick-wall low-pass filter, and its impulse response is a sinc function. Therefore, reconstruction is performed by summing shifted sinc functions weighted by the sample values.</w:t>
+      </w:r>
+    </w:p>
+    <w:p>
+      <w:pPr>
+        <w:numPr>
+          <w:ilvl w:val="0"/>
+          <w:numId w:val="1000"/>
+        </w:numPr>
+      </w:pPr>
+      <w:r>
+        <w:t xml:space="preserve">A strong student answer would be:</w:t>
+      </w:r>
+      <w:r>
+        <w:t xml:space="preserve"> </w:t>
+      </w:r>
+      <w:r>
+        <w:t xml:space="preserve">“Each sample scales a shifted sinc, and the sinc functions interpolate exactly through the original sample values.”</w:t>
+      </w:r>
+    </w:p>
+    <w:p>
+      <w:pPr>
+        <w:numPr>
+          <w:ilvl w:val="0"/>
+          <w:numId w:val="1000"/>
+        </w:numPr>
+      </w:pPr>
+      <w:r>
+        <w:t xml:space="preserve">This directly follows the lecture’s derivation from ideal low-pass filtering to sinc interpolation.</w:t>
+      </w:r>
+    </w:p>
+    <w:p>
+      <w:pPr>
+        <w:numPr>
+          <w:ilvl w:val="0"/>
+          <w:numId w:val="1050"/>
+        </w:numPr>
+      </w:pPr>
+      <w:r>
+        <w:rPr>
+          <w:b/>
+          <w:bCs/>
+        </w:rPr>
+        <w:t xml:space="preserve">Why does sinc interpolation pass exactly through the sample values?</w:t>
+      </w:r>
+    </w:p>
+    <w:p>
+      <w:pPr>
+        <w:numPr>
+          <w:ilvl w:val="0"/>
+          <w:numId w:val="1000"/>
+        </w:numPr>
+      </w:pPr>
+      <w:r>
+        <w:rPr>
+          <w:b/>
+          <w:bCs/>
+        </w:rPr>
+        <w:t xml:space="preserve">Answer:</w:t>
+      </w:r>
+      <w:r>
+        <w:t xml:space="preserve"> </w:t>
+      </w:r>
+      <w:r>
+        <w:t xml:space="preserve">Because the normalized sinc function is zero at every nonzero integer offset and equals 1 at zero. At (t=mT), all sinc terms vanish except the one centered at (mT).</w:t>
+      </w:r>
+    </w:p>
+    <w:p>
+      <w:pPr>
+        <w:numPr>
+          <w:ilvl w:val="0"/>
+          <w:numId w:val="1000"/>
+        </w:numPr>
+      </w:pPr>
+      <w:r>
+        <w:t xml:space="preserve">So:</w:t>
+      </w:r>
+    </w:p>
+    <w:p>
+      <w:pPr>
+        <w:pStyle w:val="BodyText"/>
+      </w:pPr>
+      <m:oMathPara>
+        <m:oMathParaPr>
+          <m:jc m:val="center"/>
+        </m:oMathParaPr>
+        <m:oMath>
+          <m:sSub>
+            <m:e>
+              <m:r>
+                <m:t>x</m:t>
+              </m:r>
+            </m:e>
+            <m:sub>
+              <m:r>
+                <m:t>r</m:t>
+              </m:r>
+            </m:sub>
+          </m:sSub>
+          <m:d>
+            <m:dPr>
+              <m:begChr m:val="("/>
+              <m:endChr m:val=")"/>
+              <m:sepChr m:val=""/>
+              <m:grow/>
+            </m:dPr>
+            <m:e>
+              <m:r>
+                <m:t>m</m:t>
+              </m:r>
+              <m:r>
+                <m:t>T</m:t>
+              </m:r>
+            </m:e>
+          </m:d>
+          <m:r>
+            <m:rPr>
+              <m:sty m:val="p"/>
+            </m:rPr>
+            <m:t>=</m:t>
+          </m:r>
+          <m:r>
+            <m:t>x</m:t>
+          </m:r>
+          <m:d>
+            <m:dPr>
+              <m:begChr m:val="["/>
+              <m:endChr m:val="]"/>
+              <m:sepChr m:val=""/>
+              <m:grow/>
+            </m:dPr>
+            <m:e>
+              <m:r>
+                <m:t>m</m:t>
+              </m:r>
+            </m:e>
+          </m:d>
+          <m:r>
+            <m:rPr>
+              <m:sty m:val="p"/>
+            </m:rPr>
+            <m:t>.</m:t>
+          </m:r>
+        </m:oMath>
+      </m:oMathPara>
+    </w:p>
+    <w:p>
+      <w:pPr>
+        <w:numPr>
+          <w:ilvl w:val="0"/>
+          <w:numId w:val="1000"/>
+        </w:numPr>
+      </w:pPr>
+      <w:r>
+        <w:t xml:space="preserve">This is a very good conceptual check because it shows whether students understand why sinc interpolation actually works rather than simply recognizing the formula.</w:t>
+      </w:r>
+    </w:p>
+    <w:p>
+      <w:pPr>
+        <w:numPr>
+          <w:ilvl w:val="0"/>
+          <w:numId w:val="1050"/>
+        </w:numPr>
+      </w:pPr>
+      <w:r>
+        <w:rPr>
+          <w:b/>
+          <w:bCs/>
+        </w:rPr>
+        <w:t xml:space="preserve">Why don't practical DACs usually implement ideal sinc interpolation directly?</w:t>
+      </w:r>
+    </w:p>
+    <w:p>
+      <w:pPr>
+        <w:numPr>
+          <w:ilvl w:val="0"/>
+          <w:numId w:val="1000"/>
+        </w:numPr>
+      </w:pPr>
+      <w:r>
+        <w:rPr>
+          <w:b/>
+          <w:bCs/>
+        </w:rPr>
+        <w:t xml:space="preserve">Answer:</w:t>
+      </w:r>
+      <w:r>
+        <w:t xml:space="preserve"> </w:t>
+      </w:r>
+      <w:r>
+        <w:t xml:space="preserve">Because an ideal sinc impulse response has infinite duration and is noncausal. A real DAC instead usually produces a simpler waveform such as a zero-order hold and then uses an analog reconstruction filter.</w:t>
+      </w:r>
+    </w:p>
+    <w:p>
+      <w:pPr>
+        <w:numPr>
+          <w:ilvl w:val="0"/>
+          <w:numId w:val="1000"/>
+        </w:numPr>
+      </w:pPr>
+      <w:r>
+        <w:t xml:space="preserve">The lecture explicitly contrasts ideal interpolation with the practical DAC approach.</w:t>
+      </w:r>
+    </w:p>
+    <w:p>
+      <w:pPr>
+        <w:numPr>
+          <w:ilvl w:val="0"/>
+          <w:numId w:val="1050"/>
+        </w:numPr>
+      </w:pPr>
+      <w:r>
+        <w:rPr>
+          <w:b/>
+          <w:bCs/>
+        </w:rPr>
+        <w:t xml:space="preserve">What does a zero-order hold do in the time domain?</w:t>
+      </w:r>
+    </w:p>
+    <w:p>
+      <w:pPr>
+        <w:numPr>
+          <w:ilvl w:val="0"/>
+          <w:numId w:val="1000"/>
+        </w:numPr>
+      </w:pPr>
+      <w:r>
+        <w:rPr>
+          <w:b/>
+          <w:bCs/>
+        </w:rPr>
+        <w:t xml:space="preserve">Answer:</w:t>
+      </w:r>
+      <w:r>
+        <w:t xml:space="preserve"> </w:t>
+      </w:r>
+      <w:r>
+        <w:t xml:space="preserve">It holds each sample value constant for one sampling period.</w:t>
+      </w:r>
+    </w:p>
+    <w:p>
+      <w:pPr>
+        <w:numPr>
+          <w:ilvl w:val="0"/>
+          <w:numId w:val="1000"/>
+        </w:numPr>
+      </w:pPr>
+      <w:r>
+        <w:rPr>
+          <w:b/>
+          <w:bCs/>
+        </w:rPr>
+        <w:t xml:space="preserve">Follow-up:</w:t>
+      </w:r>
+      <w:r>
+        <w:t xml:space="preserve"> </w:t>
+      </w:r>
+      <w:r>
+        <w:t xml:space="preserve">What does that do in frequency?</w:t>
+      </w:r>
+    </w:p>
+    <w:p>
+      <w:pPr>
+        <w:numPr>
+          <w:ilvl w:val="0"/>
+          <w:numId w:val="1000"/>
+        </w:numPr>
+      </w:pPr>
+      <w:r>
+        <w:rPr>
+          <w:b/>
+          <w:bCs/>
+        </w:rPr>
+        <w:t xml:space="preserve">Answer:</w:t>
+      </w:r>
+      <w:r>
+        <w:t xml:space="preserve"> </w:t>
+      </w:r>
+      <w:r>
+        <w:t xml:space="preserve">It introduces a sinc-shaped magnitude response, causing progressively greater attenuation at higher frequencies.</w:t>
+      </w:r>
+    </w:p>
+    <w:p>
+      <w:pPr>
+        <w:numPr>
+          <w:ilvl w:val="0"/>
+          <w:numId w:val="1000"/>
+        </w:numPr>
+      </w:pPr>
+      <w:r>
+        <w:t xml:space="preserve">This makes a nice two-part exit-ticket question because students must connect the time-domain staircase to the frequency-domain droop.</w:t>
+      </w:r>
+    </w:p>
+    <w:p>
+      <w:pPr>
+        <w:numPr>
+          <w:ilvl w:val="0"/>
+          <w:numId w:val="1050"/>
+        </w:numPr>
+      </w:pPr>
+      <w:r>
+        <w:rPr>
+          <w:b/>
+          <w:bCs/>
+        </w:rPr>
+        <w:t xml:space="preserve">True or false: The frequency droop produced by a zero-order hold is random noise.</w:t>
+      </w:r>
+    </w:p>
+    <w:p>
+      <w:pPr>
+        <w:numPr>
+          <w:ilvl w:val="0"/>
+          <w:numId w:val="1000"/>
+        </w:numPr>
+      </w:pPr>
+      <w:r>
+        <w:rPr>
+          <w:b/>
+          <w:bCs/>
+        </w:rPr>
+        <w:t xml:space="preserve">Answer:</w:t>
+      </w:r>
+      <w:r>
+        <w:t xml:space="preserve"> </w:t>
+      </w:r>
+      <w:r>
+        <w:rPr>
+          <w:b/>
+          <w:bCs/>
+        </w:rPr>
+        <w:t xml:space="preserve">False.</w:t>
+      </w:r>
+      <w:r>
+        <w:t xml:space="preserve"> </w:t>
+      </w:r>
+      <w:r>
+        <w:t xml:space="preserve">It is a deterministic frequency-response effect.</w:t>
+      </w:r>
+    </w:p>
+    <w:p>
+      <w:pPr>
+        <w:numPr>
+          <w:ilvl w:val="0"/>
+          <w:numId w:val="1000"/>
+        </w:numPr>
+      </w:pPr>
+      <w:r>
+        <w:rPr>
+          <w:b/>
+          <w:bCs/>
+        </w:rPr>
+        <w:t xml:space="preserve">Better answer:</w:t>
+      </w:r>
+      <w:r>
+        <w:t xml:space="preserve"> </w:t>
+      </w:r>
+      <w:r>
+        <w:t xml:space="preserve">The ZOH has a sinc-shaped transfer-function magnitude, so higher-frequency components are attenuated in a predictable way.</w:t>
+      </w:r>
+    </w:p>
+    <w:p>
+      <w:pPr>
+        <w:numPr>
+          <w:ilvl w:val="0"/>
+          <w:numId w:val="1000"/>
+        </w:numPr>
+      </w:pPr>
+      <w:r>
+        <w:t xml:space="preserve">That distinction is explicitly emphasized in the lecture.</w:t>
+      </w:r>
+    </w:p>
+    <w:p>
+      <w:pPr>
+        <w:numPr>
+          <w:ilvl w:val="0"/>
+          <w:numId w:val="1050"/>
+        </w:numPr>
+      </w:pPr>
+      <w:r>
+        <w:rPr>
+          <w:b/>
+          <w:bCs/>
+        </w:rPr>
+        <w:t xml:space="preserve">A DAC uses a zero-order hold. What is the purpose of the analog reconstruction filter that follows it?</w:t>
+      </w:r>
+    </w:p>
+    <w:p>
+      <w:pPr>
+        <w:numPr>
+          <w:ilvl w:val="0"/>
+          <w:numId w:val="1000"/>
+        </w:numPr>
+      </w:pPr>
+      <w:r>
+        <w:rPr>
+          <w:b/>
+          <w:bCs/>
+        </w:rPr>
+        <w:t xml:space="preserve">Answer:</w:t>
+      </w:r>
+      <w:r>
+        <w:t xml:space="preserve"> </w:t>
+      </w:r>
+      <w:r>
+        <w:t xml:space="preserve">Primarily to remove spectral images around multiples of the sampling frequency. It can also help compensate some of the ZOH passband droop.</w:t>
+      </w:r>
+    </w:p>
+    <w:p>
+      <w:pPr>
+        <w:numPr>
+          <w:ilvl w:val="0"/>
+          <w:numId w:val="1000"/>
+        </w:numPr>
+      </w:pPr>
+      <w:r>
+        <w:t xml:space="preserve">This tests whether students see the DAC and analog filter as one reconstruction chain rather than treating the DAC output as the final waveform.</w:t>
+      </w:r>
+    </w:p>
+    <w:p>
+      <w:pPr>
+        <w:numPr>
+          <w:ilvl w:val="0"/>
+          <w:numId w:val="1050"/>
+        </w:numPr>
+      </w:pPr>
+      <w:r>
+        <w:rPr>
+          <w:b/>
+          <w:bCs/>
+        </w:rPr>
+        <w:t xml:space="preserve">What is the difference between sampling and quantization?</w:t>
+      </w:r>
+    </w:p>
+    <w:p>
+      <w:pPr>
+        <w:numPr>
+          <w:ilvl w:val="0"/>
+          <w:numId w:val="1000"/>
+        </w:numPr>
+      </w:pPr>
+      <w:r>
+        <w:rPr>
+          <w:b/>
+          <w:bCs/>
+        </w:rPr>
+        <w:t xml:space="preserve">Answer:</w:t>
+      </w:r>
+    </w:p>
+    <w:p>
+      <w:pPr>
+        <w:pStyle w:val="Compact"/>
+        <w:numPr>
+          <w:ilvl w:val="1"/>
+          <w:numId w:val="1051"/>
+        </w:numPr>
+      </w:pPr>
+      <w:r>
+        <w:t xml:space="preserve">Sampling discretizes</w:t>
+      </w:r>
+      <w:r>
+        <w:t xml:space="preserve"> </w:t>
+      </w:r>
+      <w:r>
+        <w:rPr>
+          <w:b/>
+          <w:bCs/>
+        </w:rPr>
+        <w:t xml:space="preserve">time</w:t>
+      </w:r>
+      <w:r>
+        <w:t xml:space="preserve">.</w:t>
+      </w:r>
+    </w:p>
+    <w:p>
+      <w:pPr>
+        <w:pStyle w:val="Compact"/>
+        <w:numPr>
+          <w:ilvl w:val="1"/>
+          <w:numId w:val="1051"/>
+        </w:numPr>
+      </w:pPr>
+      <w:r>
+        <w:t xml:space="preserve">Quantization discretizes</w:t>
+      </w:r>
+      <w:r>
+        <w:t xml:space="preserve"> </w:t>
+      </w:r>
+      <w:r>
+        <w:rPr>
+          <w:b/>
+          <w:bCs/>
+        </w:rPr>
+        <w:t xml:space="preserve">amplitude</w:t>
+      </w:r>
+      <w:r>
+        <w:t xml:space="preserve">.</w:t>
+      </w:r>
+    </w:p>
+    <w:p>
+      <w:pPr>
+        <w:numPr>
+          <w:ilvl w:val="0"/>
+          <w:numId w:val="1000"/>
+        </w:numPr>
+      </w:pPr>
+      <w:r>
+        <w:t xml:space="preserve">This is simple, but it is worth asking because students often mix the two concepts. The lecture makes this distinction explicitly.</w:t>
+      </w:r>
+    </w:p>
+    <w:p>
+      <w:pPr>
+        <w:numPr>
+          <w:ilvl w:val="0"/>
+          <w:numId w:val="1050"/>
+        </w:numPr>
+      </w:pPr>
+      <w:r>
+        <w:rPr>
+          <w:b/>
+          <w:bCs/>
+        </w:rPr>
+        <w:t xml:space="preserve">How many nominal quantization levels does an (8)-bit quantizer have?</w:t>
+      </w:r>
+    </w:p>
+    <w:p>
+      <w:pPr>
+        <w:numPr>
+          <w:ilvl w:val="0"/>
+          <w:numId w:val="1000"/>
+        </w:numPr>
+      </w:pPr>
+      <w:r>
+        <w:rPr>
+          <w:b/>
+          <w:bCs/>
+        </w:rPr>
+        <w:t xml:space="preserve">Answer:</w:t>
+      </w:r>
+    </w:p>
+    <w:p>
+      <w:pPr>
+        <w:pStyle w:val="BodyText"/>
+      </w:pPr>
+      <m:oMathPara>
+        <m:oMathParaPr>
+          <m:jc m:val="center"/>
+        </m:oMathParaPr>
+        <m:oMath>
+          <m:sSup>
+            <m:e>
+              <m:r>
+                <m:t>2</m:t>
+              </m:r>
+            </m:e>
+            <m:sup>
+              <m:r>
+                <m:t>8</m:t>
+              </m:r>
+            </m:sup>
+          </m:sSup>
+          <m:r>
+            <m:rPr>
+              <m:sty m:val="p"/>
+            </m:rPr>
+            <m:t>=</m:t>
+          </m:r>
+          <m:r>
+            <m:t>256</m:t>
+          </m:r>
+          <m:r>
+            <m:rPr>
+              <m:sty m:val="p"/>
+            </m:rPr>
+            <m:t>.</m:t>
+          </m:r>
+        </m:oMath>
+      </m:oMathPara>
+    </w:p>
+    <w:p>
+      <w:pPr>
+        <w:numPr>
+          <w:ilvl w:val="0"/>
+          <w:numId w:val="1000"/>
+        </w:numPr>
+      </w:pPr>
+      <w:r>
+        <w:rPr>
+          <w:b/>
+          <w:bCs/>
+        </w:rPr>
+        <w:t xml:space="preserve">Follow-up:</w:t>
+      </w:r>
+      <w:r>
+        <w:t xml:space="preserve"> </w:t>
+      </w:r>
+      <w:r>
+        <w:t xml:space="preserve">What happens to the quantization step</w:t>
+      </w:r>
+      <w:r>
+        <w:t xml:space="preserve"> </w:t>
+      </w:r>
+      <m:oMath>
+        <m:r>
+          <m:t>Δ</m:t>
+        </m:r>
+      </m:oMath>
+      <w:r>
+        <w:t xml:space="preserve"> </w:t>
+      </w:r>
+      <w:r>
+        <w:t xml:space="preserve">if you add one more bit?</w:t>
+      </w:r>
+    </w:p>
+    <w:p>
+      <w:pPr>
+        <w:numPr>
+          <w:ilvl w:val="0"/>
+          <w:numId w:val="1000"/>
+        </w:numPr>
+      </w:pPr>
+      <w:r>
+        <w:rPr>
+          <w:b/>
+          <w:bCs/>
+        </w:rPr>
+        <w:t xml:space="preserve">Answer:</w:t>
+      </w:r>
+      <w:r>
+        <w:t xml:space="preserve"> </w:t>
+      </w:r>
+      <w:r>
+        <w:t xml:space="preserve">It is approximately cut in half.</w:t>
+      </w:r>
+    </w:p>
+    <w:p>
+      <w:pPr>
+        <w:numPr>
+          <w:ilvl w:val="0"/>
+          <w:numId w:val="1000"/>
+        </w:numPr>
+      </w:pPr>
+      <w:r>
+        <w:t xml:space="preserve">Since quantization-noise power is proportional to</w:t>
+      </w:r>
+      <w:r>
+        <w:t xml:space="preserve"> </w:t>
+      </w:r>
+      <m:oMath>
+        <m:sSup>
+          <m:e>
+            <m:r>
+              <m:t>Δ</m:t>
+            </m:r>
+          </m:e>
+          <m:sup>
+            <m:r>
+              <m:t>2</m:t>
+            </m:r>
+          </m:sup>
+        </m:sSup>
+      </m:oMath>
+      <w:r>
+        <w:t xml:space="preserve">, halving</w:t>
+      </w:r>
+      <w:r>
+        <w:t xml:space="preserve"> </w:t>
+      </w:r>
+      <m:oMath>
+        <m:r>
+          <m:t>Δ</m:t>
+        </m:r>
+      </m:oMath>
+      <w:r>
+        <w:t xml:space="preserve"> </w:t>
+      </w:r>
+      <w:r>
+        <w:t xml:space="preserve">reduces the noise power by approximately a factor of 4.</w:t>
+      </w:r>
+    </w:p>
+    <w:p>
+      <w:pPr>
+        <w:numPr>
+          <w:ilvl w:val="0"/>
+          <w:numId w:val="1050"/>
+        </w:numPr>
+      </w:pPr>
+      <w:r>
+        <w:rPr>
+          <w:b/>
+          <w:bCs/>
+        </w:rPr>
+        <w:t xml:space="preserve">Approximately how much does ideal SQNR improve when one bit is added?</w:t>
+      </w:r>
+    </w:p>
+    <w:p>
+      <w:pPr>
+        <w:numPr>
+          <w:ilvl w:val="0"/>
+          <w:numId w:val="1000"/>
+        </w:numPr>
+      </w:pPr>
+      <w:r>
+        <w:rPr>
+          <w:b/>
+          <w:bCs/>
+        </w:rPr>
+        <w:t xml:space="preserve">Answer:</w:t>
+      </w:r>
+      <w:r>
+        <w:t xml:space="preserve"> </w:t>
+      </w:r>
+      <w:r>
+        <w:t xml:space="preserve">About</w:t>
+      </w:r>
+    </w:p>
+    <w:p>
+      <w:pPr>
+        <w:pStyle w:val="BodyText"/>
+      </w:pPr>
+      <m:oMathPara>
+        <m:oMathParaPr>
+          <m:jc m:val="center"/>
+        </m:oMathParaPr>
+        <m:oMath>
+          <m:r>
+            <m:t>6</m:t>
+          </m:r>
+          <m:r>
+            <m:rPr>
+              <m:nor/>
+              <m:sty m:val="p"/>
+            </m:rPr>
+            <m:t> dB per bit</m:t>
+          </m:r>
+          <m:r>
+            <m:rPr>
+              <m:sty m:val="p"/>
+            </m:rPr>
+            <m:t>.</m:t>
+          </m:r>
+        </m:oMath>
+      </m:oMathPara>
+    </w:p>
+    <w:p>
+      <w:pPr>
+        <w:numPr>
+          <w:ilvl w:val="0"/>
+          <w:numId w:val="1000"/>
+        </w:numPr>
+      </w:pPr>
+      <w:r>
+        <w:t xml:space="preserve">More precisely, for a full-scale sine,</w:t>
+      </w:r>
+    </w:p>
+    <w:p>
+      <w:pPr>
+        <w:pStyle w:val="BodyText"/>
+      </w:pPr>
+      <m:oMathPara>
+        <m:oMathParaPr>
+          <m:jc m:val="center"/>
+        </m:oMathParaPr>
+        <m:oMath>
+          <m:r>
+            <m:rPr>
+              <m:sty m:val="p"/>
+            </m:rPr>
+            <m:t>S</m:t>
+          </m:r>
+          <m:r>
+            <m:rPr>
+              <m:sty m:val="p"/>
+            </m:rPr>
+            <m:t>Q</m:t>
+          </m:r>
+          <m:r>
+            <m:rPr>
+              <m:sty m:val="p"/>
+            </m:rPr>
+            <m:t>N</m:t>
+          </m:r>
+          <m:r>
+            <m:rPr>
+              <m:sty m:val="p"/>
+            </m:rPr>
+            <m:t>R</m:t>
+          </m:r>
+          <m:r>
+            <m:rPr>
+              <m:sty m:val="p"/>
+            </m:rPr>
+            <m:t>≈</m:t>
+          </m:r>
+          <m:r>
+            <m:t>6.02</m:t>
+          </m:r>
+          <m:r>
+            <m:t>B</m:t>
+          </m:r>
+          <m:r>
+            <m:rPr>
+              <m:sty m:val="p"/>
+            </m:rPr>
+            <m:t>+</m:t>
+          </m:r>
+          <m:r>
+            <m:t>1.76</m:t>
+          </m:r>
+          <m:r>
+            <m:rPr>
+              <m:nor/>
+              <m:sty m:val="p"/>
+            </m:rPr>
+            <m:t> dB</m:t>
+          </m:r>
+          <m:r>
+            <m:rPr>
+              <m:sty m:val="p"/>
+            </m:rPr>
+            <m:t>.</m:t>
+          </m:r>
+        </m:oMath>
+      </m:oMathPara>
+    </w:p>
+    <w:p>
+      <w:pPr>
+        <w:numPr>
+          <w:ilvl w:val="0"/>
+          <w:numId w:val="1000"/>
+        </w:numPr>
+      </w:pPr>
+      <w:r>
+        <w:t xml:space="preserve">The “6 dB per bit” result comes from the fact that one extra bit halves</w:t>
+      </w:r>
+      <w:r>
+        <w:t xml:space="preserve"> </w:t>
+      </w:r>
+      <m:oMath>
+        <m:r>
+          <m:t>Δ</m:t>
+        </m:r>
+      </m:oMath>
+      <w:r>
+        <w:t xml:space="preserve">, reducing quantization-noise power by a factor of 4.</w:t>
+      </w:r>
+    </w:p>
+    <w:p>
+      <w:pPr>
+        <w:numPr>
+          <w:ilvl w:val="0"/>
+          <w:numId w:val="1050"/>
+        </w:numPr>
+      </w:pPr>
+      <w:r>
+        <w:rPr>
+          <w:b/>
+          <w:bCs/>
+        </w:rPr>
+        <w:t xml:space="preserve">Estimate the ideal SQNR of a full-scale 10-bit sinusoid.</w:t>
+      </w:r>
+    </w:p>
+    <w:p>
+      <w:pPr>
+        <w:pStyle w:val="FirstParagraph"/>
+      </w:pPr>
+      <w:r>
+        <w:rPr>
+          <w:b/>
+          <w:bCs/>
+        </w:rPr>
+        <w:t xml:space="preserve">Answer:</w:t>
+      </w:r>
+    </w:p>
+    <w:p>
+      <w:pPr>
+        <w:pStyle w:val="BodyText"/>
+      </w:pPr>
+      <m:oMathPara>
+        <m:oMathParaPr>
+          <m:jc m:val="center"/>
+        </m:oMathParaPr>
+        <m:oMath>
+          <m:r>
+            <m:rPr>
+              <m:sty m:val="p"/>
+            </m:rPr>
+            <m:t>S</m:t>
+          </m:r>
+          <m:r>
+            <m:rPr>
+              <m:sty m:val="p"/>
+            </m:rPr>
+            <m:t>Q</m:t>
+          </m:r>
+          <m:r>
+            <m:rPr>
+              <m:sty m:val="p"/>
+            </m:rPr>
+            <m:t>N</m:t>
+          </m:r>
+          <m:r>
+            <m:rPr>
+              <m:sty m:val="p"/>
+            </m:rPr>
+            <m:t>R</m:t>
+          </m:r>
+          <m:r>
+            <m:rPr>
+              <m:sty m:val="p"/>
+            </m:rPr>
+            <m:t>≈</m:t>
+          </m:r>
+          <m:r>
+            <m:t>6.02</m:t>
+          </m:r>
+          <m:d>
+            <m:dPr>
+              <m:begChr m:val="("/>
+              <m:endChr m:val=")"/>
+              <m:sepChr m:val=""/>
+              <m:grow/>
+            </m:dPr>
+            <m:e>
+              <m:r>
+                <m:t>10</m:t>
+              </m:r>
+            </m:e>
+          </m:d>
+          <m:r>
+            <m:rPr>
+              <m:sty m:val="p"/>
+            </m:rPr>
+            <m:t>+</m:t>
+          </m:r>
+          <m:r>
+            <m:t>1.76</m:t>
+          </m:r>
+        </m:oMath>
+      </m:oMathPara>
+    </w:p>
+    <w:p>
+      <w:pPr>
+        <w:pStyle w:val="FirstParagraph"/>
+      </w:pPr>
+      <m:oMathPara>
+        <m:oMathParaPr>
+          <m:jc m:val="center"/>
+        </m:oMathParaPr>
+        <m:oMath>
+          <m:r>
+            <m:rPr>
+              <m:sty m:val="p"/>
+            </m:rPr>
+            <m:t>≈</m:t>
+          </m:r>
+          <m:r>
+            <m:t>61.96</m:t>
+          </m:r>
+          <m:r>
+            <m:rPr>
+              <m:nor/>
+              <m:sty m:val="p"/>
+            </m:rPr>
+            <m:t> dB</m:t>
+          </m:r>
+        </m:oMath>
+      </m:oMathPara>
+    </w:p>
+    <w:p>
+      <w:pPr>
+        <w:pStyle w:val="FirstParagraph"/>
+      </w:pPr>
+      <w:r>
+        <w:t xml:space="preserve">or about</w:t>
+      </w:r>
+      <w:r>
+        <w:t xml:space="preserve"> </w:t>
+      </w:r>
+      <w:r>
+        <w:rPr>
+          <w:b/>
+          <w:bCs/>
+        </w:rPr>
+        <w:t xml:space="preserve">62 dB</w:t>
+      </w:r>
+      <w:r>
+        <w:t xml:space="preserve">.</w:t>
+      </w:r>
+    </w:p>
+    <w:p>
+      <w:pPr>
+        <w:pStyle w:val="Compact"/>
+        <w:numPr>
+          <w:ilvl w:val="0"/>
+          <w:numId w:val="1052"/>
+        </w:numPr>
+      </w:pPr>
+      <w:r>
+        <w:rPr>
+          <w:b/>
+          <w:bCs/>
+        </w:rPr>
+        <w:t xml:space="preserve">Estimate the ideal SQNR of a full-scale 12-bit sinusoid.</w:t>
+      </w:r>
+    </w:p>
+    <w:p>
+      <w:pPr>
+        <w:pStyle w:val="FirstParagraph"/>
+      </w:pPr>
+      <w:r>
+        <w:rPr>
+          <w:b/>
+          <w:bCs/>
+        </w:rPr>
+        <w:t xml:space="preserve">Answer:</w:t>
+      </w:r>
+    </w:p>
+    <w:p>
+      <w:pPr>
+        <w:pStyle w:val="BodyText"/>
+      </w:pPr>
+      <m:oMathPara>
+        <m:oMathParaPr>
+          <m:jc m:val="center"/>
+        </m:oMathParaPr>
+        <m:oMath>
+          <m:r>
+            <m:t>6.02</m:t>
+          </m:r>
+          <m:d>
+            <m:dPr>
+              <m:begChr m:val="("/>
+              <m:endChr m:val=")"/>
+              <m:sepChr m:val=""/>
+              <m:grow/>
+            </m:dPr>
+            <m:e>
+              <m:r>
+                <m:t>12</m:t>
+              </m:r>
+            </m:e>
+          </m:d>
+          <m:r>
+            <m:rPr>
+              <m:sty m:val="p"/>
+            </m:rPr>
+            <m:t>+</m:t>
+          </m:r>
+          <m:r>
+            <m:t>1.76</m:t>
+          </m:r>
+          <m:r>
+            <m:rPr>
+              <m:sty m:val="p"/>
+            </m:rPr>
+            <m:t>=</m:t>
+          </m:r>
+          <m:r>
+            <m:t>74.0</m:t>
+          </m:r>
+          <m:r>
+            <m:rPr>
+              <m:nor/>
+              <m:sty m:val="p"/>
+            </m:rPr>
+            <m:t> dB</m:t>
+          </m:r>
+          <m:r>
+            <m:rPr>
+              <m:sty m:val="p"/>
+            </m:rPr>
+            <m:t>.</m:t>
+          </m:r>
+        </m:oMath>
+      </m:oMathPara>
+    </w:p>
+    <w:p>
+      <w:pPr>
+        <w:pStyle w:val="FirstParagraph"/>
+      </w:pPr>
+      <w:r>
+        <w:t xml:space="preserve">This is also the calculation already included in the lecture's existing exit check.</w:t>
+      </w:r>
+    </w:p>
+    <w:p>
+      <w:pPr>
+        <w:pStyle w:val="Compact"/>
+        <w:numPr>
+          <w:ilvl w:val="0"/>
+          <w:numId w:val="1053"/>
+        </w:numPr>
+      </w:pPr>
+      <w:r>
+        <w:rPr>
+          <w:b/>
+          <w:bCs/>
+        </w:rPr>
+        <w:t xml:space="preserve">Why is the common statement “16-bit audio has about 96 dB of dynamic range” slightly different from the (98.1) dB SQNR result?</w:t>
+      </w:r>
+    </w:p>
+    <w:p>
+      <w:pPr>
+        <w:pStyle w:val="FirstParagraph"/>
+      </w:pPr>
+      <w:r>
+        <w:rPr>
+          <w:b/>
+          <w:bCs/>
+        </w:rPr>
+        <w:t xml:space="preserve">Answer:</w:t>
+      </w:r>
+      <w:r>
+        <w:t xml:space="preserve"> </w:t>
+      </w:r>
+      <w:r>
+        <w:t xml:space="preserve">They use slightly different reference calculations. Roughly (6) dB/bit gives about (96) dB, while</w:t>
+      </w:r>
+    </w:p>
+    <w:p>
+      <w:pPr>
+        <w:pStyle w:val="BodyText"/>
+      </w:pPr>
+      <m:oMathPara>
+        <m:oMathParaPr>
+          <m:jc m:val="center"/>
+        </m:oMathParaPr>
+        <m:oMath>
+          <m:r>
+            <m:t>6.02</m:t>
+          </m:r>
+          <m:r>
+            <m:t>B</m:t>
+          </m:r>
+          <m:r>
+            <m:rPr>
+              <m:sty m:val="p"/>
+            </m:rPr>
+            <m:t>+</m:t>
+          </m:r>
+          <m:r>
+            <m:t>1.76</m:t>
+          </m:r>
+        </m:oMath>
+      </m:oMathPara>
+    </w:p>
+    <w:p>
+      <w:pPr>
+        <w:pStyle w:val="FirstParagraph"/>
+      </w:pPr>
+      <w:r>
+        <w:t xml:space="preserve">gives approximately (98.1) dB for a full-scale sine because it incorporates the RMS power of the sine and the uniform quantization-error model.</w:t>
+      </w:r>
+    </w:p>
+    <w:p>
+      <w:pPr>
+        <w:pStyle w:val="BodyText"/>
+      </w:pPr>
+      <w:r>
+        <w:t xml:space="preserve">That is a stronger exit question for an advanced class because it tests whether students understand where the numbers come from rather than treating them as conflicting facts.</w:t>
+      </w:r>
+    </w:p>
+    <w:p>
+      <w:pPr>
+        <w:pStyle w:val="Compact"/>
+        <w:numPr>
+          <w:ilvl w:val="0"/>
+          <w:numId w:val="1054"/>
+        </w:numPr>
+      </w:pPr>
+      <w:r>
+        <w:rPr>
+          <w:b/>
+          <w:bCs/>
+        </w:rPr>
+        <w:t xml:space="preserve">A recording is stored as 16-bit PCM. You convert it to a PyTorch</w:t>
+      </w:r>
+      <w:r>
+        <w:rPr>
+          <w:b/>
+          <w:bCs/>
+        </w:rPr>
+        <w:t xml:space="preserve"> </w:t>
+      </w:r>
+      <w:r>
+        <w:rPr>
+          <w:rStyle w:val="VerbatimChar"/>
+          <w:b/>
+          <w:bCs/>
+        </w:rPr>
+        <w:t xml:space="preserve">float32</w:t>
+      </w:r>
+      <w:r>
+        <w:rPr>
+          <w:b/>
+          <w:bCs/>
+        </w:rPr>
+        <w:t xml:space="preserve"> </w:t>
+      </w:r>
+      <w:r>
+        <w:rPr>
+          <w:b/>
+          <w:bCs/>
+        </w:rPr>
+        <w:t xml:space="preserve">tensor. Has the signal now gained additional amplitude resolution?</w:t>
+      </w:r>
+    </w:p>
+    <w:p>
+      <w:pPr>
+        <w:pStyle w:val="FirstParagraph"/>
+      </w:pPr>
+      <w:r>
+        <w:rPr>
+          <w:b/>
+          <w:bCs/>
+        </w:rPr>
+        <w:t xml:space="preserve">Answer:</w:t>
+      </w:r>
+      <w:r>
+        <w:t xml:space="preserve"> </w:t>
+      </w:r>
+      <w:r>
+        <w:rPr>
+          <w:b/>
+          <w:bCs/>
+        </w:rPr>
+        <w:t xml:space="preserve">No.</w:t>
+      </w:r>
+    </w:p>
+    <w:p>
+      <w:pPr>
+        <w:pStyle w:val="BodyText"/>
+      </w:pPr>
+      <w:r>
+        <w:t xml:space="preserve">The representation used for subsequent computation has changed, but the information captured during quantization has not. Values between the original 16-bit quantization levels cannot be recovered just by casting the data to</w:t>
+      </w:r>
+      <w:r>
+        <w:t xml:space="preserve"> </w:t>
+      </w:r>
+      <w:r>
+        <w:rPr>
+          <w:rStyle w:val="VerbatimChar"/>
+        </w:rPr>
+        <w:t xml:space="preserve">float32</w:t>
+      </w:r>
+      <w:r>
+        <w:t xml:space="preserve">.</w:t>
+      </w:r>
+    </w:p>
+    <w:p>
+      <w:pPr>
+        <w:pStyle w:val="BodyText"/>
+      </w:pPr>
+      <w:r>
+        <w:t xml:space="preserve">This would be one of my favorite exit-ticket questions because it connects the DSP material directly to the later ML part of the course.</w:t>
+      </w:r>
+    </w:p>
+    <w:p>
+      <w:pPr>
+        <w:pStyle w:val="Compact"/>
+        <w:numPr>
+          <w:ilvl w:val="0"/>
+          <w:numId w:val="1055"/>
+        </w:numPr>
+      </w:pPr>
+      <w:r>
+        <w:rPr>
+          <w:b/>
+          <w:bCs/>
+        </w:rPr>
+        <w:t xml:space="preserve">True or false: If an audio recording is stored as</w:t>
+      </w:r>
+      <w:r>
+        <w:rPr>
+          <w:b/>
+          <w:bCs/>
+        </w:rPr>
+        <w:t xml:space="preserve"> </w:t>
+      </w:r>
+      <w:r>
+        <w:rPr>
+          <w:rStyle w:val="VerbatimChar"/>
+          <w:b/>
+          <w:bCs/>
+        </w:rPr>
+        <w:t xml:space="preserve">float32</w:t>
+      </w:r>
+      <w:r>
+        <w:rPr>
+          <w:b/>
+          <w:bCs/>
+        </w:rPr>
+        <w:t xml:space="preserve">, it cannot contain significant quantization error.</w:t>
+      </w:r>
+    </w:p>
+    <w:p>
+      <w:pPr>
+        <w:pStyle w:val="FirstParagraph"/>
+      </w:pPr>
+      <w:r>
+        <w:rPr>
+          <w:b/>
+          <w:bCs/>
+        </w:rPr>
+        <w:t xml:space="preserve">Answer:</w:t>
+      </w:r>
+      <w:r>
+        <w:t xml:space="preserve"> </w:t>
+      </w:r>
+      <w:r>
+        <w:rPr>
+          <w:b/>
+          <w:bCs/>
+        </w:rPr>
+        <w:t xml:space="preserve">False.</w:t>
+      </w:r>
+    </w:p>
+    <w:p>
+      <w:pPr>
+        <w:pStyle w:val="BodyText"/>
+      </w:pPr>
+      <w:r>
+        <w:t xml:space="preserve">A</w:t>
+      </w:r>
+      <w:r>
+        <w:t xml:space="preserve"> </w:t>
+      </w:r>
+      <w:r>
+        <w:rPr>
+          <w:rStyle w:val="VerbatimChar"/>
+        </w:rPr>
+        <w:t xml:space="preserve">float32</w:t>
+      </w:r>
+      <w:r>
+        <w:t xml:space="preserve"> </w:t>
+      </w:r>
+      <w:r>
+        <w:t xml:space="preserve">tensor may simply contain values that originated from a much lower-resolution ADC or PCM file. More computational precision does not restore information that was lost during acquisition.</w:t>
+      </w:r>
+    </w:p>
+    <w:p>
+      <w:pPr>
+        <w:pStyle w:val="Compact"/>
+        <w:numPr>
+          <w:ilvl w:val="0"/>
+          <w:numId w:val="1056"/>
+        </w:numPr>
+      </w:pPr>
+      <w:r>
+        <w:rPr>
+          <w:b/>
+          <w:bCs/>
+        </w:rPr>
+        <w:t xml:space="preserve">The additive quantization-noise model assumes quantization error is approximately uniform and uncorrelated with the signal. Is this always true?</w:t>
+      </w:r>
+    </w:p>
+    <w:p>
+      <w:pPr>
+        <w:pStyle w:val="FirstParagraph"/>
+      </w:pPr>
+      <w:r>
+        <w:rPr>
+          <w:b/>
+          <w:bCs/>
+        </w:rPr>
+        <w:t xml:space="preserve">Answer:</w:t>
+      </w:r>
+      <w:r>
+        <w:t xml:space="preserve"> </w:t>
+      </w:r>
+      <w:r>
+        <w:rPr>
+          <w:b/>
+          <w:bCs/>
+        </w:rPr>
+        <w:t xml:space="preserve">No.</w:t>
+      </w:r>
+    </w:p>
+    <w:p>
+      <w:pPr>
+        <w:pStyle w:val="BodyText"/>
+      </w:pPr>
+      <w:r>
+        <w:t xml:space="preserve">It is a useful approximation when the signal spans many quantization levels and the error is sufficiently decorrelated from the signal. Low-level signals can produce structured or signal-correlated quantization error.</w:t>
+      </w:r>
+    </w:p>
+    <w:p>
+      <w:pPr>
+        <w:pStyle w:val="BodyText"/>
+      </w:pPr>
+      <w:r>
+        <w:t xml:space="preserve">This is a very good higher-level conceptual question because it tests whether students understand the distinction between a mathematical model and physical reality.</w:t>
+      </w:r>
+    </w:p>
+    <w:p>
+      <w:pPr>
+        <w:pStyle w:val="BodyText"/>
+      </w:pPr>
+      <w:r>
+        <w:t xml:space="preserve">For a</w:t>
+      </w:r>
+      <w:r>
+        <w:t xml:space="preserve"> </w:t>
+      </w:r>
+      <w:r>
+        <w:rPr>
+          <w:b/>
+          <w:bCs/>
+        </w:rPr>
+        <w:t xml:space="preserve">3-question exit ticket</w:t>
+      </w:r>
+      <w:r>
+        <w:t xml:space="preserve">, I would probably use these:</w:t>
+      </w:r>
+    </w:p>
+    <w:p>
+      <w:pPr>
+        <w:pStyle w:val="BodyText"/>
+      </w:pPr>
+      <w:r>
+        <w:rPr>
+          <w:b/>
+          <w:bCs/>
+        </w:rPr>
+        <w:t xml:space="preserve">1. Explain in one sentence why ideal reconstruction produces sinc interpolation.</w:t>
+      </w:r>
+    </w:p>
+    <w:p>
+      <w:pPr>
+        <w:pStyle w:val="BodyText"/>
+      </w:pPr>
+      <w:r>
+        <w:rPr>
+          <w:b/>
+          <w:bCs/>
+        </w:rPr>
+        <w:t xml:space="preserve">Answer:</w:t>
+      </w:r>
+      <w:r>
+        <w:t xml:space="preserve"> </w:t>
+      </w:r>
+      <w:r>
+        <w:t xml:space="preserve">Because the ideal reconstruction system is a brick-wall low-pass filter whose impulse response is a sinc.</w:t>
+      </w:r>
+    </w:p>
+    <w:p>
+      <w:pPr>
+        <w:pStyle w:val="BodyText"/>
+      </w:pPr>
+      <w:r>
+        <w:rPr>
+          <w:b/>
+          <w:bCs/>
+        </w:rPr>
+        <w:t xml:space="preserve">2. A DAC uses a zero-order hold. What happens to its frequency response as frequency increases?</w:t>
+      </w:r>
+    </w:p>
+    <w:p>
+      <w:pPr>
+        <w:pStyle w:val="BodyText"/>
+      </w:pPr>
+      <w:r>
+        <w:rPr>
+          <w:b/>
+          <w:bCs/>
+        </w:rPr>
+        <w:t xml:space="preserve">Answer:</w:t>
+      </w:r>
+      <w:r>
+        <w:t xml:space="preserve"> </w:t>
+      </w:r>
+      <w:r>
+        <w:t xml:space="preserve">The response follows a sinc-shaped envelope, so higher frequencies experience progressively greater magnitude droop.</w:t>
+      </w:r>
+    </w:p>
+    <w:p>
+      <w:pPr>
+        <w:pStyle w:val="BodyText"/>
+      </w:pPr>
+      <w:r>
+        <w:rPr>
+          <w:b/>
+          <w:bCs/>
+        </w:rPr>
+        <w:t xml:space="preserve">3. An audio file recorded with a 12-bit ADC is converted to</w:t>
+      </w:r>
+      <w:r>
+        <w:rPr>
+          <w:b/>
+          <w:bCs/>
+        </w:rPr>
+        <w:t xml:space="preserve"> </w:t>
+      </w:r>
+      <w:r>
+        <w:rPr>
+          <w:rStyle w:val="VerbatimChar"/>
+          <w:b/>
+          <w:bCs/>
+        </w:rPr>
+        <w:t xml:space="preserve">float32</w:t>
+      </w:r>
+      <w:r>
+        <w:rPr>
+          <w:b/>
+          <w:bCs/>
+        </w:rPr>
+        <w:t xml:space="preserve"> </w:t>
+      </w:r>
+      <w:r>
+        <w:rPr>
+          <w:b/>
+          <w:bCs/>
+        </w:rPr>
+        <w:t xml:space="preserve">for PyTorch. Does it now have 32-bit measurement accuracy? Explain.</w:t>
+      </w:r>
+    </w:p>
+    <w:p>
+      <w:pPr>
+        <w:pStyle w:val="BodyText"/>
+      </w:pPr>
+      <w:r>
+        <w:rPr>
+          <w:b/>
+          <w:bCs/>
+        </w:rPr>
+        <w:t xml:space="preserve">Answer:</w:t>
+      </w:r>
+      <w:r>
+        <w:t xml:space="preserve"> </w:t>
+      </w:r>
+      <w:r>
+        <w:t xml:space="preserve">No.</w:t>
+      </w:r>
+      <w:r>
+        <w:t xml:space="preserve"> </w:t>
+      </w:r>
+      <w:r>
+        <w:rPr>
+          <w:rStyle w:val="VerbatimChar"/>
+        </w:rPr>
+        <w:t xml:space="preserve">float32</w:t>
+      </w:r>
+      <w:r>
+        <w:t xml:space="preserve"> </w:t>
+      </w:r>
+      <w:r>
+        <w:t xml:space="preserve">gives more numerical precision for computation, but it cannot recreate amplitude information lost during the original 12-bit quantization.</w:t>
+      </w:r>
+    </w:p>
+    <w:p>
+      <w:pPr>
+        <w:pStyle w:val="BodyText"/>
+      </w:pPr>
+      <w:r>
+        <w:t xml:space="preserve">I particularly like that set because the questions move from</w:t>
+      </w:r>
+      <w:r>
+        <w:t xml:space="preserve"> </w:t>
+      </w:r>
+      <w:r>
+        <w:rPr>
+          <w:b/>
+          <w:bCs/>
+        </w:rPr>
+        <w:t xml:space="preserve">ideal theory → practical hardware → DSP/ML interpretation</w:t>
+      </w:r>
+      <w:r>
+        <w:t xml:space="preserve">, which is exactly the progression of the lecture. The lecture summary itself follows essentially that same structure: sinc interpolation, ZOH behavior, quantization/SQNR, and the distinction between PCM bit depth and computational dtype.</w:t>
+      </w:r>
+    </w:p>
+    <w:p>
+      <w:pPr>
+        <w:pStyle w:val="BodyText"/>
+      </w:pPr>
+      <w:r>
+        <w:t xml:space="preserve">If you want a slightly more quantitative exit ticket, I would substitute Question 3 with:</w:t>
+      </w:r>
+    </w:p>
+    <w:p>
+      <w:pPr>
+        <w:pStyle w:val="BodyText"/>
+      </w:pPr>
+      <w:r>
+        <w:rPr>
+          <w:b/>
+          <w:bCs/>
+        </w:rPr>
+        <w:t xml:space="preserve">A full-scale 8-bit sinusoid has approximately what ideal SQNR?</w:t>
+      </w:r>
+    </w:p>
+    <w:p>
+      <w:pPr>
+        <w:pStyle w:val="BodyText"/>
+      </w:pPr>
+      <m:oMathPara>
+        <m:oMathParaPr>
+          <m:jc m:val="center"/>
+        </m:oMathParaPr>
+        <m:oMath>
+          <m:r>
+            <m:t>6.02</m:t>
+          </m:r>
+          <m:d>
+            <m:dPr>
+              <m:begChr m:val="("/>
+              <m:endChr m:val=")"/>
+              <m:sepChr m:val=""/>
+              <m:grow/>
+            </m:dPr>
+            <m:e>
+              <m:r>
+                <m:t>8</m:t>
+              </m:r>
+            </m:e>
+          </m:d>
+          <m:r>
+            <m:rPr>
+              <m:sty m:val="p"/>
+            </m:rPr>
+            <m:t>+</m:t>
+          </m:r>
+          <m:r>
+            <m:t>1.76</m:t>
+          </m:r>
+          <m:r>
+            <m:rPr>
+              <m:sty m:val="p"/>
+            </m:rPr>
+            <m:t>≈</m:t>
+          </m:r>
+          <m:r>
+            <m:t>49.9</m:t>
+          </m:r>
+          <m:r>
+            <m:rPr>
+              <m:nor/>
+              <m:sty m:val="p"/>
+            </m:rPr>
+            <m:t> dB</m:t>
+          </m:r>
+          <m:r>
+            <m:rPr>
+              <m:sty m:val="p"/>
+            </m:rPr>
+            <m:t>.</m:t>
+          </m:r>
+        </m:oMath>
+      </m:oMathPara>
+    </w:p>
+    <w:p>
+      <w:pPr>
+        <w:pStyle w:val="FirstParagraph"/>
+      </w:pPr>
+      <w:r>
+        <w:t xml:space="preserve">That one is useful because a student who answers</w:t>
+      </w:r>
+      <w:r>
+        <w:t xml:space="preserve"> </w:t>
+      </w:r>
+      <w:r>
+        <w:rPr>
+          <w:b/>
+          <w:bCs/>
+        </w:rPr>
+        <w:t xml:space="preserve">48 dB</w:t>
+      </w:r>
+      <w:r>
+        <w:t xml:space="preserve"> </w:t>
+      </w:r>
+      <w:r>
+        <w:t xml:space="preserve">is showing that they remember the (6\text{ dB/bit}) approximation, while a student who gets</w:t>
+      </w:r>
+      <w:r>
+        <w:t xml:space="preserve"> </w:t>
+      </w:r>
+      <w:r>
+        <w:rPr>
+          <w:b/>
+          <w:bCs/>
+        </w:rPr>
+        <w:t xml:space="preserve">about 50 dB</w:t>
+      </w:r>
+      <w:r>
+        <w:t xml:space="preserve"> </w:t>
+      </w:r>
+      <w:r>
+        <w:t xml:space="preserve">understands the full-scale-sine formula. Both responses tell you something useful about where they are conceptually.</w:t>
+      </w:r>
+    </w:p>
+    <w:p>
+      <w:r>
+        <w:pict>
+          <v:rect style="width:0;height:1.5pt" o:hralign="center" o:hrstd="t" o:hr="t"/>
+        </w:pict>
+      </w:r>
+    </w:p>
+    <w:bookmarkEnd w:id="132"/>
+    <w:bookmarkEnd w:id="133"/>
+    <w:bookmarkStart w:id="134" w:name="b08e2002-306c-4f27-ba78-9dbcd05e257a"/>
+    <w:p>
+      <w:pPr>
+        <w:pStyle w:val="SourceCode"/>
+      </w:pPr>
+    </w:p>
+    <w:bookmarkEnd w:id="134"/>
     <w:sectPr/>
   </w:body>
 </w:document>
@@ -26715,6 +29701,219 @@
     <w:abstractNumId w:val="991"/>
   </w:num>
   <w:num w:numId="1048">
+    <w:abstractNumId w:val="99201"/>
+    <w:lvlOverride w:ilvl="0">
+      <w:startOverride w:val="1"/>
+    </w:lvlOverride>
+    <w:lvlOverride w:ilvl="1">
+      <w:startOverride w:val="1"/>
+    </w:lvlOverride>
+    <w:lvlOverride w:ilvl="2">
+      <w:startOverride w:val="1"/>
+    </w:lvlOverride>
+    <w:lvlOverride w:ilvl="3">
+      <w:startOverride w:val="1"/>
+    </w:lvlOverride>
+    <w:lvlOverride w:ilvl="4">
+      <w:startOverride w:val="1"/>
+    </w:lvlOverride>
+    <w:lvlOverride w:ilvl="5">
+      <w:startOverride w:val="1"/>
+    </w:lvlOverride>
+    <w:lvlOverride w:ilvl="6">
+      <w:startOverride w:val="1"/>
+    </w:lvlOverride>
+    <w:lvlOverride w:ilvl="7">
+      <w:startOverride w:val="1"/>
+    </w:lvlOverride>
+    <w:lvlOverride w:ilvl="8">
+      <w:startOverride w:val="1"/>
+    </w:lvlOverride>
+  </w:num>
+  <w:num w:numId="1049">
+    <w:abstractNumId w:val="99201"/>
+    <w:lvlOverride w:ilvl="0">
+      <w:startOverride w:val="1"/>
+    </w:lvlOverride>
+    <w:lvlOverride w:ilvl="1">
+      <w:startOverride w:val="1"/>
+    </w:lvlOverride>
+    <w:lvlOverride w:ilvl="2">
+      <w:startOverride w:val="1"/>
+    </w:lvlOverride>
+    <w:lvlOverride w:ilvl="3">
+      <w:startOverride w:val="1"/>
+    </w:lvlOverride>
+    <w:lvlOverride w:ilvl="4">
+      <w:startOverride w:val="1"/>
+    </w:lvlOverride>
+    <w:lvlOverride w:ilvl="5">
+      <w:startOverride w:val="1"/>
+    </w:lvlOverride>
+    <w:lvlOverride w:ilvl="6">
+      <w:startOverride w:val="1"/>
+    </w:lvlOverride>
+    <w:lvlOverride w:ilvl="7">
+      <w:startOverride w:val="1"/>
+    </w:lvlOverride>
+    <w:lvlOverride w:ilvl="8">
+      <w:startOverride w:val="1"/>
+    </w:lvlOverride>
+  </w:num>
+  <w:num w:numId="1050">
+    <w:abstractNumId w:val="99201"/>
+    <w:lvlOverride w:ilvl="0">
+      <w:startOverride w:val="1"/>
+    </w:lvlOverride>
+    <w:lvlOverride w:ilvl="1">
+      <w:startOverride w:val="1"/>
+    </w:lvlOverride>
+    <w:lvlOverride w:ilvl="2">
+      <w:startOverride w:val="1"/>
+    </w:lvlOverride>
+    <w:lvlOverride w:ilvl="3">
+      <w:startOverride w:val="1"/>
+    </w:lvlOverride>
+    <w:lvlOverride w:ilvl="4">
+      <w:startOverride w:val="1"/>
+    </w:lvlOverride>
+    <w:lvlOverride w:ilvl="5">
+      <w:startOverride w:val="1"/>
+    </w:lvlOverride>
+    <w:lvlOverride w:ilvl="6">
+      <w:startOverride w:val="1"/>
+    </w:lvlOverride>
+    <w:lvlOverride w:ilvl="7">
+      <w:startOverride w:val="1"/>
+    </w:lvlOverride>
+    <w:lvlOverride w:ilvl="8">
+      <w:startOverride w:val="1"/>
+    </w:lvlOverride>
+  </w:num>
+  <w:num w:numId="1051">
+    <w:abstractNumId w:val="991"/>
+  </w:num>
+  <w:num w:numId="1052">
+    <w:abstractNumId w:val="99201"/>
+    <w:lvlOverride w:ilvl="0">
+      <w:startOverride w:val="1"/>
+    </w:lvlOverride>
+    <w:lvlOverride w:ilvl="1">
+      <w:startOverride w:val="1"/>
+    </w:lvlOverride>
+    <w:lvlOverride w:ilvl="2">
+      <w:startOverride w:val="1"/>
+    </w:lvlOverride>
+    <w:lvlOverride w:ilvl="3">
+      <w:startOverride w:val="1"/>
+    </w:lvlOverride>
+    <w:lvlOverride w:ilvl="4">
+      <w:startOverride w:val="1"/>
+    </w:lvlOverride>
+    <w:lvlOverride w:ilvl="5">
+      <w:startOverride w:val="1"/>
+    </w:lvlOverride>
+    <w:lvlOverride w:ilvl="6">
+      <w:startOverride w:val="1"/>
+    </w:lvlOverride>
+    <w:lvlOverride w:ilvl="7">
+      <w:startOverride w:val="1"/>
+    </w:lvlOverride>
+    <w:lvlOverride w:ilvl="8">
+      <w:startOverride w:val="1"/>
+    </w:lvlOverride>
+  </w:num>
+  <w:num w:numId="1053">
+    <w:abstractNumId w:val="99201"/>
+    <w:lvlOverride w:ilvl="0">
+      <w:startOverride w:val="1"/>
+    </w:lvlOverride>
+    <w:lvlOverride w:ilvl="1">
+      <w:startOverride w:val="1"/>
+    </w:lvlOverride>
+    <w:lvlOverride w:ilvl="2">
+      <w:startOverride w:val="1"/>
+    </w:lvlOverride>
+    <w:lvlOverride w:ilvl="3">
+      <w:startOverride w:val="1"/>
+    </w:lvlOverride>
+    <w:lvlOverride w:ilvl="4">
+      <w:startOverride w:val="1"/>
+    </w:lvlOverride>
+    <w:lvlOverride w:ilvl="5">
+      <w:startOverride w:val="1"/>
+    </w:lvlOverride>
+    <w:lvlOverride w:ilvl="6">
+      <w:startOverride w:val="1"/>
+    </w:lvlOverride>
+    <w:lvlOverride w:ilvl="7">
+      <w:startOverride w:val="1"/>
+    </w:lvlOverride>
+    <w:lvlOverride w:ilvl="8">
+      <w:startOverride w:val="1"/>
+    </w:lvlOverride>
+  </w:num>
+  <w:num w:numId="1054">
+    <w:abstractNumId w:val="99201"/>
+    <w:lvlOverride w:ilvl="0">
+      <w:startOverride w:val="1"/>
+    </w:lvlOverride>
+    <w:lvlOverride w:ilvl="1">
+      <w:startOverride w:val="1"/>
+    </w:lvlOverride>
+    <w:lvlOverride w:ilvl="2">
+      <w:startOverride w:val="1"/>
+    </w:lvlOverride>
+    <w:lvlOverride w:ilvl="3">
+      <w:startOverride w:val="1"/>
+    </w:lvlOverride>
+    <w:lvlOverride w:ilvl="4">
+      <w:startOverride w:val="1"/>
+    </w:lvlOverride>
+    <w:lvlOverride w:ilvl="5">
+      <w:startOverride w:val="1"/>
+    </w:lvlOverride>
+    <w:lvlOverride w:ilvl="6">
+      <w:startOverride w:val="1"/>
+    </w:lvlOverride>
+    <w:lvlOverride w:ilvl="7">
+      <w:startOverride w:val="1"/>
+    </w:lvlOverride>
+    <w:lvlOverride w:ilvl="8">
+      <w:startOverride w:val="1"/>
+    </w:lvlOverride>
+  </w:num>
+  <w:num w:numId="1055">
+    <w:abstractNumId w:val="99201"/>
+    <w:lvlOverride w:ilvl="0">
+      <w:startOverride w:val="1"/>
+    </w:lvlOverride>
+    <w:lvlOverride w:ilvl="1">
+      <w:startOverride w:val="1"/>
+    </w:lvlOverride>
+    <w:lvlOverride w:ilvl="2">
+      <w:startOverride w:val="1"/>
+    </w:lvlOverride>
+    <w:lvlOverride w:ilvl="3">
+      <w:startOverride w:val="1"/>
+    </w:lvlOverride>
+    <w:lvlOverride w:ilvl="4">
+      <w:startOverride w:val="1"/>
+    </w:lvlOverride>
+    <w:lvlOverride w:ilvl="5">
+      <w:startOverride w:val="1"/>
+    </w:lvlOverride>
+    <w:lvlOverride w:ilvl="6">
+      <w:startOverride w:val="1"/>
+    </w:lvlOverride>
+    <w:lvlOverride w:ilvl="7">
+      <w:startOverride w:val="1"/>
+    </w:lvlOverride>
+    <w:lvlOverride w:ilvl="8">
+      <w:startOverride w:val="1"/>
+    </w:lvlOverride>
+  </w:num>
+  <w:num w:numId="1056">
     <w:abstractNumId w:val="99201"/>
     <w:lvlOverride w:ilvl="0">
       <w:startOverride w:val="1"/>

</xml_diff>